<commit_message>
Adjunto Doc invidual - Avance Doc Product Vision
</commit_message>
<xml_diff>
--- a/Fase 2/Evidencias Proyecto (version Agil)/Documento 01- Product Vision.docx
+++ b/Fase 2/Evidencias Proyecto (version Agil)/Documento 01- Product Vision.docx
@@ -1,6 +1,6 @@
 
 <file path=word/document.xml><?xml version="1.0" encoding="utf-8"?>
-<w:document xmlns:wpc="http://schemas.microsoft.com/office/word/2010/wordprocessingCanvas" xmlns:cx="http://schemas.microsoft.com/office/drawing/2014/chartex" xmlns:cx1="http://schemas.microsoft.com/office/drawing/2015/9/8/chartex" xmlns:cx2="http://schemas.microsoft.com/office/drawing/2015/10/21/chartex" xmlns:cx3="http://schemas.microsoft.com/office/drawing/2016/5/9/chartex" xmlns:cx4="http://schemas.microsoft.com/office/drawing/2016/5/10/chartex" xmlns:cx5="http://schemas.microsoft.com/office/drawing/2016/5/11/chartex" xmlns:cx6="http://schemas.microsoft.com/office/drawing/2016/5/12/chartex" xmlns:cx7="http://schemas.microsoft.com/office/drawing/2016/5/13/chartex" xmlns:cx8="http://schemas.microsoft.com/office/drawing/2016/5/14/chartex" xmlns:mc="http://schemas.openxmlformats.org/markup-compatibility/2006" xmlns:m="http://schemas.openxmlformats.org/officeDocument/2006/math" xmlns:aink="http://schemas.microsoft.com/office/drawing/2016/ink" xmlns:am3d="http://schemas.microsoft.com/office/drawing/2017/model3d" xmlns:oel="http://schemas.microsoft.com/office/2019/extlst" xmlns:r="http://schemas.openxmlformats.org/officeDocument/2006/relationships" xmlns:wp14="http://schemas.microsoft.com/office/word/2010/wordprocessingDrawing" xmlns:wp="http://schemas.openxmlformats.org/drawingml/2006/wordprocessingDrawing" xmlns:wpg="http://schemas.microsoft.com/office/word/2010/wordprocessingGroup" xmlns:wpi="http://schemas.microsoft.com/office/word/2010/wordprocessingInk" xmlns:wps="http://schemas.microsoft.com/office/word/2010/wordprocessingShape" xmlns:o="urn:schemas-microsoft-com:office:office" xmlns:v="urn:schemas-microsoft-com:vml" xmlns:w10="urn:schemas-microsoft-com:office:word" xmlns:w="http://schemas.openxmlformats.org/wordprocessingml/2006/main" xmlns:w14="http://schemas.microsoft.com/office/word/2010/wordml" xmlns:w15="http://schemas.microsoft.com/office/word/2012/wordml" xmlns:w16cex="http://schemas.microsoft.com/office/word/2018/wordml/cex" xmlns:w16cid="http://schemas.microsoft.com/office/word/2016/wordml/cid" xmlns:w16="http://schemas.microsoft.com/office/word/2018/wordml" xmlns:w16sdtdh="http://schemas.microsoft.com/office/word/2020/wordml/sdtdatahash" xmlns:w16sdtfl="http://schemas.microsoft.com/office/word/2024/wordml/sdtformatlock" xmlns:w16se="http://schemas.microsoft.com/office/word/2015/wordml/symex" xmlns:w16du="http://schemas.microsoft.com/office/word/2023/wordml/word16du" xmlns:wne="http://schemas.microsoft.com/office/word/2006/wordml" mc:Ignorable="w14 w15 w16se w16cid w16 w16cex w16sdtdh w16sdtfl w16du wp14">
+<w:document xmlns:wpc="http://schemas.microsoft.com/office/word/2010/wordprocessingCanvas" xmlns:cx="http://schemas.microsoft.com/office/drawing/2014/chartex" xmlns:cx1="http://schemas.microsoft.com/office/drawing/2015/9/8/chartex" xmlns:cx2="http://schemas.microsoft.com/office/drawing/2015/10/21/chartex" xmlns:cx3="http://schemas.microsoft.com/office/drawing/2016/5/9/chartex" xmlns:cx4="http://schemas.microsoft.com/office/drawing/2016/5/10/chartex" xmlns:cx5="http://schemas.microsoft.com/office/drawing/2016/5/11/chartex" xmlns:cx6="http://schemas.microsoft.com/office/drawing/2016/5/12/chartex" xmlns:cx7="http://schemas.microsoft.com/office/drawing/2016/5/13/chartex" xmlns:cx8="http://schemas.microsoft.com/office/drawing/2016/5/14/chartex" xmlns:mc="http://schemas.openxmlformats.org/markup-compatibility/2006" xmlns:aink="http://schemas.microsoft.com/office/drawing/2016/ink" xmlns:am3d="http://schemas.microsoft.com/office/drawing/2017/model3d" xmlns:o="urn:schemas-microsoft-com:office:office" xmlns:r="http://schemas.openxmlformats.org/officeDocument/2006/relationships" xmlns:m="http://schemas.openxmlformats.org/officeDocument/2006/math" xmlns:v="urn:schemas-microsoft-com:vml" xmlns:wp14="http://schemas.microsoft.com/office/word/2010/wordprocessingDrawing" xmlns:wp="http://schemas.openxmlformats.org/drawingml/2006/wordprocessingDrawing" xmlns:w10="urn:schemas-microsoft-com:office:word" xmlns:w="http://schemas.openxmlformats.org/wordprocessingml/2006/main" xmlns:w14="http://schemas.microsoft.com/office/word/2010/wordml" xmlns:w15="http://schemas.microsoft.com/office/word/2012/wordml" xmlns:w16cex="http://schemas.microsoft.com/office/word/2018/wordml/cex" xmlns:w16cid="http://schemas.microsoft.com/office/word/2016/wordml/cid" xmlns:w16="http://schemas.microsoft.com/office/word/2018/wordml" xmlns:w16sdtdh="http://schemas.microsoft.com/office/word/2020/wordml/sdtdatahash" xmlns:w16se="http://schemas.microsoft.com/office/word/2015/wordml/symex" xmlns:wpg="http://schemas.microsoft.com/office/word/2010/wordprocessingGroup" xmlns:wpi="http://schemas.microsoft.com/office/word/2010/wordprocessingInk" xmlns:wne="http://schemas.microsoft.com/office/word/2006/wordml" xmlns:wps="http://schemas.microsoft.com/office/word/2010/wordprocessingShape" mc:Ignorable="w14 w15 w16se w16cid w16 w16cex w16sdtdh wp14">
   <w:body>
     <w:sdt>
       <w:sdtPr>
@@ -102,6 +102,7 @@
                 <w:dataBinding w:prefixMappings="xmlns:ns0='http://schemas.openxmlformats.org/package/2006/metadata/core-properties' xmlns:ns1='http://purl.org/dc/elements/1.1/'" w:xpath="/ns0:coreProperties[1]/ns1:title[1]" w:storeItemID="{6C3C8BC8-F283-45AE-878A-BAB7291924A1}"/>
                 <w:text/>
               </w:sdtPr>
+              <w:sdtEndPr/>
               <w:sdtContent>
                 <w:tc>
                   <w:tcPr>
@@ -152,7 +153,6 @@
                 <w:rPr>
                   <w:rFonts w:eastAsiaTheme="majorEastAsia" w:cstheme="minorHAnsi"/>
                   <w:i/>
-                  <w:color w:val="FF0000"/>
                   <w:sz w:val="44"/>
                   <w:szCs w:val="44"/>
                   <w:lang w:val="es-AR"/>
@@ -162,6 +162,7 @@
                 <w:dataBinding w:prefixMappings="xmlns:ns0='http://schemas.openxmlformats.org/package/2006/metadata/core-properties' xmlns:ns1='http://purl.org/dc/elements/1.1/'" w:xpath="/ns0:coreProperties[1]/ns1:subject[1]" w:storeItemID="{6C3C8BC8-F283-45AE-878A-BAB7291924A1}"/>
                 <w:text/>
               </w:sdtPr>
+              <w:sdtEndPr/>
               <w:sdtContent>
                 <w:tc>
                   <w:tcPr>
@@ -185,7 +186,6 @@
                       <w:rPr>
                         <w:rFonts w:eastAsiaTheme="majorEastAsia" w:cstheme="minorHAnsi"/>
                         <w:i/>
-                        <w:color w:val="FF0000"/>
                         <w:sz w:val="44"/>
                         <w:szCs w:val="44"/>
                         <w:lang w:val="es-AR"/>
@@ -196,12 +196,11 @@
                       <w:rPr>
                         <w:rFonts w:eastAsiaTheme="majorEastAsia" w:cstheme="minorHAnsi"/>
                         <w:i/>
-                        <w:color w:val="FF0000"/>
                         <w:sz w:val="44"/>
                         <w:szCs w:val="44"/>
                         <w:lang w:val="es-AR"/>
                       </w:rPr>
-                      <w:t>[Insertar Nombre de Proyecto]</w:t>
+                      <w:t>CACHAI-QA</w:t>
                     </w:r>
                   </w:p>
                 </w:tc>
@@ -313,14 +312,15 @@
                 </w:rPr>
                 <w:alias w:val="Fecha"/>
                 <w:id w:val="516659546"/>
-                <w:showingPlcHdr/>
                 <w:dataBinding w:prefixMappings="xmlns:ns0='http://schemas.microsoft.com/office/2006/coverPageProps'" w:xpath="/ns0:CoverPageProperties[1]/ns0:PublishDate[1]" w:storeItemID="{55AF091B-3C7A-41E3-B477-F2FDAA23CFDA}"/>
-                <w:date>
+                <w:date w:fullDate="2026-09-28T00:00:00Z">
+                  <w:dateFormat w:val="dd/MM/yyyy"/>
                   <w:lid w:val="es-ES"/>
                   <w:storeMappedDataAs w:val="dateTime"/>
                   <w:calendar w:val="gregorian"/>
                 </w:date>
               </w:sdtPr>
+              <w:sdtEndPr/>
               <w:sdtContent>
                 <w:tc>
                   <w:tcPr>
@@ -342,9 +342,8 @@
                         <w:rFonts w:cstheme="minorHAnsi"/>
                         <w:b/>
                         <w:bCs/>
-                        <w:color w:val="FF0000"/>
                       </w:rPr>
-                      <w:t>[Seleccionar fecha]</w:t>
+                      <w:t>28/09/2026</w:t>
                     </w:r>
                   </w:p>
                 </w:tc>
@@ -390,6 +389,7 @@
                 <w:dataBinding w:prefixMappings="xmlns:ns0='http://schemas.microsoft.com/office/2006/coverPageProps'" w:xpath="/ns0:CoverPageProperties[1]/ns0:Abstract[1]" w:storeItemID="{55AF091B-3C7A-41E3-B477-F2FDAA23CFDA}"/>
                 <w:text/>
               </w:sdtPr>
+              <w:sdtEndPr/>
               <w:sdtContent>
                 <w:tc>
                   <w:tcPr>
@@ -522,6 +522,7 @@
           <w:docPartUnique/>
         </w:docPartObj>
       </w:sdtPr>
+      <w:sdtEndPr/>
       <w:sdtContent>
         <w:p>
           <w:pPr>
@@ -551,11 +552,9 @@
               <w:bCs w:val="0"/>
               <w:caps w:val="0"/>
               <w:noProof/>
-              <w:kern w:val="2"/>
-              <w:sz w:val="24"/>
-              <w:szCs w:val="24"/>
-              <w:lang w:val="es-CL" w:eastAsia="es-MX"/>
-              <w14:ligatures w14:val="standardContextual"/>
+              <w:sz w:val="22"/>
+              <w:szCs w:val="22"/>
+              <w:lang w:val="es-CL" w:eastAsia="es-CL"/>
             </w:rPr>
           </w:pPr>
           <w:r>
@@ -583,7 +582,7 @@
             </w:rPr>
             <w:fldChar w:fldCharType="separate"/>
           </w:r>
-          <w:hyperlink w:anchor="_Toc241503854" w:history="1">
+          <w:hyperlink w:anchor="_Toc241676037" w:history="1">
             <w:r>
               <w:rPr>
                 <w:rStyle w:val="Hipervnculo"/>
@@ -600,11 +599,9 @@
                 <w:bCs w:val="0"/>
                 <w:caps w:val="0"/>
                 <w:noProof/>
-                <w:kern w:val="2"/>
-                <w:sz w:val="24"/>
-                <w:szCs w:val="24"/>
-                <w:lang w:val="es-CL" w:eastAsia="es-MX"/>
-                <w14:ligatures w14:val="standardContextual"/>
+                <w:sz w:val="22"/>
+                <w:szCs w:val="22"/>
+                <w:lang w:val="es-CL" w:eastAsia="es-CL"/>
               </w:rPr>
               <w:tab/>
             </w:r>
@@ -636,7 +633,7 @@
                 <w:noProof/>
                 <w:webHidden/>
               </w:rPr>
-              <w:instrText xml:space="preserve"> PAGEREF _Toc241503854 \h </w:instrText>
+              <w:instrText xml:space="preserve"> PAGEREF _Toc241676037 \h </w:instrText>
             </w:r>
             <w:r>
               <w:rPr>
@@ -680,14 +677,12 @@
               <w:bCs w:val="0"/>
               <w:caps w:val="0"/>
               <w:noProof/>
-              <w:kern w:val="2"/>
-              <w:sz w:val="24"/>
-              <w:szCs w:val="24"/>
-              <w:lang w:val="es-CL" w:eastAsia="es-MX"/>
-              <w14:ligatures w14:val="standardContextual"/>
+              <w:sz w:val="22"/>
+              <w:szCs w:val="22"/>
+              <w:lang w:val="es-CL" w:eastAsia="es-CL"/>
             </w:rPr>
           </w:pPr>
-          <w:hyperlink w:anchor="_Toc241503855" w:history="1">
+          <w:hyperlink w:anchor="_Toc241676038" w:history="1">
             <w:r>
               <w:rPr>
                 <w:rStyle w:val="Hipervnculo"/>
@@ -702,11 +697,9 @@
                 <w:bCs w:val="0"/>
                 <w:caps w:val="0"/>
                 <w:noProof/>
-                <w:kern w:val="2"/>
-                <w:sz w:val="24"/>
-                <w:szCs w:val="24"/>
-                <w:lang w:val="es-CL" w:eastAsia="es-MX"/>
-                <w14:ligatures w14:val="standardContextual"/>
+                <w:sz w:val="22"/>
+                <w:szCs w:val="22"/>
+                <w:lang w:val="es-CL" w:eastAsia="es-CL"/>
               </w:rPr>
               <w:tab/>
             </w:r>
@@ -736,7 +729,7 @@
                 <w:noProof/>
                 <w:webHidden/>
               </w:rPr>
-              <w:instrText xml:space="preserve"> PAGEREF _Toc241503855 \h </w:instrText>
+              <w:instrText xml:space="preserve"> PAGEREF _Toc241676038 \h </w:instrText>
             </w:r>
             <w:r>
               <w:rPr>
@@ -780,14 +773,12 @@
               <w:bCs w:val="0"/>
               <w:caps w:val="0"/>
               <w:noProof/>
-              <w:kern w:val="2"/>
-              <w:sz w:val="24"/>
-              <w:szCs w:val="24"/>
-              <w:lang w:val="es-CL" w:eastAsia="es-MX"/>
-              <w14:ligatures w14:val="standardContextual"/>
+              <w:sz w:val="22"/>
+              <w:szCs w:val="22"/>
+              <w:lang w:val="es-CL" w:eastAsia="es-CL"/>
             </w:rPr>
           </w:pPr>
-          <w:hyperlink w:anchor="_Toc241503856" w:history="1">
+          <w:hyperlink w:anchor="_Toc241676039" w:history="1">
             <w:r>
               <w:rPr>
                 <w:rStyle w:val="Hipervnculo"/>
@@ -803,11 +794,9 @@
                 <w:bCs w:val="0"/>
                 <w:caps w:val="0"/>
                 <w:noProof/>
-                <w:kern w:val="2"/>
-                <w:sz w:val="24"/>
-                <w:szCs w:val="24"/>
-                <w:lang w:val="es-CL" w:eastAsia="es-MX"/>
-                <w14:ligatures w14:val="standardContextual"/>
+                <w:sz w:val="22"/>
+                <w:szCs w:val="22"/>
+                <w:lang w:val="es-CL" w:eastAsia="es-CL"/>
               </w:rPr>
               <w:tab/>
             </w:r>
@@ -838,7 +827,7 @@
                 <w:noProof/>
                 <w:webHidden/>
               </w:rPr>
-              <w:instrText xml:space="preserve"> PAGEREF _Toc241503856 \h </w:instrText>
+              <w:instrText xml:space="preserve"> PAGEREF _Toc241676039 \h </w:instrText>
             </w:r>
             <w:r>
               <w:rPr>
@@ -880,14 +869,12 @@
               <w:rFonts w:eastAsiaTheme="minorEastAsia"/>
               <w:smallCaps w:val="0"/>
               <w:noProof/>
-              <w:kern w:val="2"/>
-              <w:sz w:val="24"/>
-              <w:szCs w:val="24"/>
-              <w:lang w:val="es-CL" w:eastAsia="es-MX"/>
-              <w14:ligatures w14:val="standardContextual"/>
+              <w:sz w:val="22"/>
+              <w:szCs w:val="22"/>
+              <w:lang w:val="es-CL" w:eastAsia="es-CL"/>
             </w:rPr>
           </w:pPr>
-          <w:hyperlink w:anchor="_Toc241503857" w:history="1">
+          <w:hyperlink w:anchor="_Toc241676040" w:history="1">
             <w:r>
               <w:rPr>
                 <w:rStyle w:val="Hipervnculo"/>
@@ -901,11 +888,9 @@
                 <w:rFonts w:eastAsiaTheme="minorEastAsia"/>
                 <w:smallCaps w:val="0"/>
                 <w:noProof/>
-                <w:kern w:val="2"/>
-                <w:sz w:val="24"/>
-                <w:szCs w:val="24"/>
-                <w:lang w:val="es-CL" w:eastAsia="es-MX"/>
-                <w14:ligatures w14:val="standardContextual"/>
+                <w:sz w:val="22"/>
+                <w:szCs w:val="22"/>
+                <w:lang w:val="es-CL" w:eastAsia="es-CL"/>
               </w:rPr>
               <w:tab/>
             </w:r>
@@ -936,7 +921,7 @@
                 <w:noProof/>
                 <w:webHidden/>
               </w:rPr>
-              <w:instrText xml:space="preserve"> PAGEREF _Toc241503857 \h </w:instrText>
+              <w:instrText xml:space="preserve"> PAGEREF _Toc241676040 \h </w:instrText>
             </w:r>
             <w:r>
               <w:rPr>
@@ -978,14 +963,12 @@
               <w:rFonts w:eastAsiaTheme="minorEastAsia"/>
               <w:smallCaps w:val="0"/>
               <w:noProof/>
-              <w:kern w:val="2"/>
-              <w:sz w:val="24"/>
-              <w:szCs w:val="24"/>
-              <w:lang w:val="es-CL" w:eastAsia="es-MX"/>
-              <w14:ligatures w14:val="standardContextual"/>
+              <w:sz w:val="22"/>
+              <w:szCs w:val="22"/>
+              <w:lang w:val="es-CL" w:eastAsia="es-CL"/>
             </w:rPr>
           </w:pPr>
-          <w:hyperlink w:anchor="_Toc241503858" w:history="1">
+          <w:hyperlink w:anchor="_Toc241676041" w:history="1">
             <w:r>
               <w:rPr>
                 <w:rStyle w:val="Hipervnculo"/>
@@ -998,11 +981,9 @@
                 <w:rFonts w:eastAsiaTheme="minorEastAsia"/>
                 <w:smallCaps w:val="0"/>
                 <w:noProof/>
-                <w:kern w:val="2"/>
-                <w:sz w:val="24"/>
-                <w:szCs w:val="24"/>
-                <w:lang w:val="es-CL" w:eastAsia="es-MX"/>
-                <w14:ligatures w14:val="standardContextual"/>
+                <w:sz w:val="22"/>
+                <w:szCs w:val="22"/>
+                <w:lang w:val="es-CL" w:eastAsia="es-CL"/>
               </w:rPr>
               <w:tab/>
             </w:r>
@@ -1032,7 +1013,7 @@
                 <w:noProof/>
                 <w:webHidden/>
               </w:rPr>
-              <w:instrText xml:space="preserve"> PAGEREF _Toc241503858 \h </w:instrText>
+              <w:instrText xml:space="preserve"> PAGEREF _Toc241676041 \h </w:instrText>
             </w:r>
             <w:r>
               <w:rPr>
@@ -1067,7 +1048,7 @@
           <w:pPr>
             <w:pStyle w:val="TDC3"/>
             <w:tabs>
-              <w:tab w:val="left" w:pos="1320"/>
+              <w:tab w:val="left" w:pos="1100"/>
               <w:tab w:val="right" w:leader="dot" w:pos="8828"/>
             </w:tabs>
             <w:rPr>
@@ -1075,14 +1056,12 @@
               <w:i w:val="0"/>
               <w:iCs w:val="0"/>
               <w:noProof/>
-              <w:kern w:val="2"/>
-              <w:sz w:val="24"/>
-              <w:szCs w:val="24"/>
-              <w:lang w:val="es-CL" w:eastAsia="es-MX"/>
-              <w14:ligatures w14:val="standardContextual"/>
+              <w:sz w:val="22"/>
+              <w:szCs w:val="22"/>
+              <w:lang w:val="es-CL" w:eastAsia="es-CL"/>
             </w:rPr>
           </w:pPr>
-          <w:hyperlink w:anchor="_Toc241503859" w:history="1">
+          <w:hyperlink w:anchor="_Toc241676042" w:history="1">
             <w:r>
               <w:rPr>
                 <w:rStyle w:val="Hipervnculo"/>
@@ -1096,11 +1075,9 @@
                 <w:i w:val="0"/>
                 <w:iCs w:val="0"/>
                 <w:noProof/>
-                <w:kern w:val="2"/>
-                <w:sz w:val="24"/>
-                <w:szCs w:val="24"/>
-                <w:lang w:val="es-CL" w:eastAsia="es-MX"/>
-                <w14:ligatures w14:val="standardContextual"/>
+                <w:sz w:val="22"/>
+                <w:szCs w:val="22"/>
+                <w:lang w:val="es-CL" w:eastAsia="es-CL"/>
               </w:rPr>
               <w:tab/>
             </w:r>
@@ -1109,7 +1086,7 @@
                 <w:rStyle w:val="Hipervnculo"/>
                 <w:noProof/>
               </w:rPr>
-              <w:t>Usuario 1</w:t>
+              <w:t>Usuario Normal/Dueño sitio web</w:t>
             </w:r>
             <w:r>
               <w:rPr>
@@ -1130,7 +1107,7 @@
                 <w:noProof/>
                 <w:webHidden/>
               </w:rPr>
-              <w:instrText xml:space="preserve"> PAGEREF _Toc241503859 \h </w:instrText>
+              <w:instrText xml:space="preserve"> PAGEREF _Toc241676042 \h </w:instrText>
             </w:r>
             <w:r>
               <w:rPr>
@@ -1165,7 +1142,7 @@
           <w:pPr>
             <w:pStyle w:val="TDC3"/>
             <w:tabs>
-              <w:tab w:val="left" w:pos="1320"/>
+              <w:tab w:val="left" w:pos="1100"/>
               <w:tab w:val="right" w:leader="dot" w:pos="8828"/>
             </w:tabs>
             <w:rPr>
@@ -1173,14 +1150,12 @@
               <w:i w:val="0"/>
               <w:iCs w:val="0"/>
               <w:noProof/>
-              <w:kern w:val="2"/>
-              <w:sz w:val="24"/>
-              <w:szCs w:val="24"/>
-              <w:lang w:val="es-CL" w:eastAsia="es-MX"/>
-              <w14:ligatures w14:val="standardContextual"/>
+              <w:sz w:val="22"/>
+              <w:szCs w:val="22"/>
+              <w:lang w:val="es-CL" w:eastAsia="es-CL"/>
             </w:rPr>
           </w:pPr>
-          <w:hyperlink w:anchor="_Toc241503860" w:history="1">
+          <w:hyperlink w:anchor="_Toc241676043" w:history="1">
             <w:r>
               <w:rPr>
                 <w:rStyle w:val="Hipervnculo"/>
@@ -1194,11 +1169,9 @@
                 <w:i w:val="0"/>
                 <w:iCs w:val="0"/>
                 <w:noProof/>
-                <w:kern w:val="2"/>
-                <w:sz w:val="24"/>
-                <w:szCs w:val="24"/>
-                <w:lang w:val="es-CL" w:eastAsia="es-MX"/>
-                <w14:ligatures w14:val="standardContextual"/>
+                <w:sz w:val="22"/>
+                <w:szCs w:val="22"/>
+                <w:lang w:val="es-CL" w:eastAsia="es-CL"/>
               </w:rPr>
               <w:tab/>
             </w:r>
@@ -1207,7 +1180,7 @@
                 <w:rStyle w:val="Hipervnculo"/>
                 <w:noProof/>
               </w:rPr>
-              <w:t>Usuario 1</w:t>
+              <w:t>Analista QA Manual</w:t>
             </w:r>
             <w:r>
               <w:rPr>
@@ -1228,7 +1201,7 @@
                 <w:noProof/>
                 <w:webHidden/>
               </w:rPr>
-              <w:instrText xml:space="preserve"> PAGEREF _Toc241503860 \h </w:instrText>
+              <w:instrText xml:space="preserve"> PAGEREF _Toc241676043 \h </w:instrText>
             </w:r>
             <w:r>
               <w:rPr>
@@ -1263,7 +1236,7 @@
           <w:pPr>
             <w:pStyle w:val="TDC3"/>
             <w:tabs>
-              <w:tab w:val="left" w:pos="1320"/>
+              <w:tab w:val="left" w:pos="1100"/>
               <w:tab w:val="right" w:leader="dot" w:pos="8828"/>
             </w:tabs>
             <w:rPr>
@@ -1271,14 +1244,12 @@
               <w:i w:val="0"/>
               <w:iCs w:val="0"/>
               <w:noProof/>
-              <w:kern w:val="2"/>
-              <w:sz w:val="24"/>
-              <w:szCs w:val="24"/>
-              <w:lang w:val="es-CL" w:eastAsia="es-MX"/>
-              <w14:ligatures w14:val="standardContextual"/>
+              <w:sz w:val="22"/>
+              <w:szCs w:val="22"/>
+              <w:lang w:val="es-CL" w:eastAsia="es-CL"/>
             </w:rPr>
           </w:pPr>
-          <w:hyperlink w:anchor="_Toc241503861" w:history="1">
+          <w:hyperlink w:anchor="_Toc241676044" w:history="1">
             <w:r>
               <w:rPr>
                 <w:rStyle w:val="Hipervnculo"/>
@@ -1292,11 +1263,9 @@
                 <w:i w:val="0"/>
                 <w:iCs w:val="0"/>
                 <w:noProof/>
-                <w:kern w:val="2"/>
-                <w:sz w:val="24"/>
-                <w:szCs w:val="24"/>
-                <w:lang w:val="es-CL" w:eastAsia="es-MX"/>
-                <w14:ligatures w14:val="standardContextual"/>
+                <w:sz w:val="22"/>
+                <w:szCs w:val="22"/>
+                <w:lang w:val="es-CL" w:eastAsia="es-CL"/>
               </w:rPr>
               <w:tab/>
             </w:r>
@@ -1305,7 +1274,7 @@
                 <w:rStyle w:val="Hipervnculo"/>
                 <w:noProof/>
               </w:rPr>
-              <w:t>Usuario 1</w:t>
+              <w:t>Desarrollador Web</w:t>
             </w:r>
             <w:r>
               <w:rPr>
@@ -1326,7 +1295,7 @@
                 <w:noProof/>
                 <w:webHidden/>
               </w:rPr>
-              <w:instrText xml:space="preserve"> PAGEREF _Toc241503861 \h </w:instrText>
+              <w:instrText xml:space="preserve"> PAGEREF _Toc241676044 \h </w:instrText>
             </w:r>
             <w:r>
               <w:rPr>
@@ -1347,6 +1316,194 @@
                 <w:webHidden/>
               </w:rPr>
               <w:t>4</w:t>
+            </w:r>
+            <w:r>
+              <w:rPr>
+                <w:noProof/>
+                <w:webHidden/>
+              </w:rPr>
+              <w:fldChar w:fldCharType="end"/>
+            </w:r>
+          </w:hyperlink>
+        </w:p>
+        <w:p>
+          <w:pPr>
+            <w:pStyle w:val="TDC3"/>
+            <w:tabs>
+              <w:tab w:val="left" w:pos="1100"/>
+              <w:tab w:val="right" w:leader="dot" w:pos="8828"/>
+            </w:tabs>
+            <w:rPr>
+              <w:rFonts w:eastAsiaTheme="minorEastAsia"/>
+              <w:i w:val="0"/>
+              <w:iCs w:val="0"/>
+              <w:noProof/>
+              <w:sz w:val="22"/>
+              <w:szCs w:val="22"/>
+              <w:lang w:val="es-CL" w:eastAsia="es-CL"/>
+            </w:rPr>
+          </w:pPr>
+          <w:hyperlink w:anchor="_Toc241676045" w:history="1">
+            <w:r>
+              <w:rPr>
+                <w:rStyle w:val="Hipervnculo"/>
+                <w:noProof/>
+              </w:rPr>
+              <w:t>4.2.4</w:t>
+            </w:r>
+            <w:r>
+              <w:rPr>
+                <w:rFonts w:eastAsiaTheme="minorEastAsia"/>
+                <w:i w:val="0"/>
+                <w:iCs w:val="0"/>
+                <w:noProof/>
+                <w:sz w:val="22"/>
+                <w:szCs w:val="22"/>
+                <w:lang w:val="es-CL" w:eastAsia="es-CL"/>
+              </w:rPr>
+              <w:tab/>
+            </w:r>
+            <w:r>
+              <w:rPr>
+                <w:rStyle w:val="Hipervnculo"/>
+                <w:noProof/>
+              </w:rPr>
+              <w:t>Dueño del producto</w:t>
+            </w:r>
+            <w:r>
+              <w:rPr>
+                <w:noProof/>
+                <w:webHidden/>
+              </w:rPr>
+              <w:tab/>
+            </w:r>
+            <w:r>
+              <w:rPr>
+                <w:noProof/>
+                <w:webHidden/>
+              </w:rPr>
+              <w:fldChar w:fldCharType="begin"/>
+            </w:r>
+            <w:r>
+              <w:rPr>
+                <w:noProof/>
+                <w:webHidden/>
+              </w:rPr>
+              <w:instrText xml:space="preserve"> PAGEREF _Toc241676045 \h </w:instrText>
+            </w:r>
+            <w:r>
+              <w:rPr>
+                <w:noProof/>
+                <w:webHidden/>
+              </w:rPr>
+            </w:r>
+            <w:r>
+              <w:rPr>
+                <w:noProof/>
+                <w:webHidden/>
+              </w:rPr>
+              <w:fldChar w:fldCharType="separate"/>
+            </w:r>
+            <w:r>
+              <w:rPr>
+                <w:noProof/>
+                <w:webHidden/>
+              </w:rPr>
+              <w:t>5</w:t>
+            </w:r>
+            <w:r>
+              <w:rPr>
+                <w:noProof/>
+                <w:webHidden/>
+              </w:rPr>
+              <w:fldChar w:fldCharType="end"/>
+            </w:r>
+          </w:hyperlink>
+        </w:p>
+        <w:p>
+          <w:pPr>
+            <w:pStyle w:val="TDC3"/>
+            <w:tabs>
+              <w:tab w:val="left" w:pos="1100"/>
+              <w:tab w:val="right" w:leader="dot" w:pos="8828"/>
+            </w:tabs>
+            <w:rPr>
+              <w:rFonts w:eastAsiaTheme="minorEastAsia"/>
+              <w:i w:val="0"/>
+              <w:iCs w:val="0"/>
+              <w:noProof/>
+              <w:sz w:val="22"/>
+              <w:szCs w:val="22"/>
+              <w:lang w:val="es-CL" w:eastAsia="es-CL"/>
+            </w:rPr>
+          </w:pPr>
+          <w:hyperlink w:anchor="_Toc241676046" w:history="1">
+            <w:r>
+              <w:rPr>
+                <w:rStyle w:val="Hipervnculo"/>
+                <w:noProof/>
+              </w:rPr>
+              <w:t>4.2.5</w:t>
+            </w:r>
+            <w:r>
+              <w:rPr>
+                <w:rFonts w:eastAsiaTheme="minorEastAsia"/>
+                <w:i w:val="0"/>
+                <w:iCs w:val="0"/>
+                <w:noProof/>
+                <w:sz w:val="22"/>
+                <w:szCs w:val="22"/>
+                <w:lang w:val="es-CL" w:eastAsia="es-CL"/>
+              </w:rPr>
+              <w:tab/>
+            </w:r>
+            <w:r>
+              <w:rPr>
+                <w:rStyle w:val="Hipervnculo"/>
+                <w:noProof/>
+              </w:rPr>
+              <w:t>Especialista en Ciberseguridad</w:t>
+            </w:r>
+            <w:r>
+              <w:rPr>
+                <w:noProof/>
+                <w:webHidden/>
+              </w:rPr>
+              <w:tab/>
+            </w:r>
+            <w:r>
+              <w:rPr>
+                <w:noProof/>
+                <w:webHidden/>
+              </w:rPr>
+              <w:fldChar w:fldCharType="begin"/>
+            </w:r>
+            <w:r>
+              <w:rPr>
+                <w:noProof/>
+                <w:webHidden/>
+              </w:rPr>
+              <w:instrText xml:space="preserve"> PAGEREF _Toc241676046 \h </w:instrText>
+            </w:r>
+            <w:r>
+              <w:rPr>
+                <w:noProof/>
+                <w:webHidden/>
+              </w:rPr>
+            </w:r>
+            <w:r>
+              <w:rPr>
+                <w:noProof/>
+                <w:webHidden/>
+              </w:rPr>
+              <w:fldChar w:fldCharType="separate"/>
+            </w:r>
+            <w:r>
+              <w:rPr>
+                <w:noProof/>
+                <w:webHidden/>
+              </w:rPr>
+              <w:t>5</w:t>
             </w:r>
             <w:r>
               <w:rPr>
@@ -1368,14 +1525,12 @@
               <w:rFonts w:eastAsiaTheme="minorEastAsia"/>
               <w:smallCaps w:val="0"/>
               <w:noProof/>
-              <w:kern w:val="2"/>
-              <w:sz w:val="24"/>
-              <w:szCs w:val="24"/>
-              <w:lang w:val="es-CL" w:eastAsia="es-MX"/>
-              <w14:ligatures w14:val="standardContextual"/>
+              <w:sz w:val="22"/>
+              <w:szCs w:val="22"/>
+              <w:lang w:val="es-CL" w:eastAsia="es-CL"/>
             </w:rPr>
           </w:pPr>
-          <w:hyperlink w:anchor="_Toc241503862" w:history="1">
+          <w:hyperlink w:anchor="_Toc241676047" w:history="1">
             <w:r>
               <w:rPr>
                 <w:rStyle w:val="Hipervnculo"/>
@@ -1389,11 +1544,9 @@
                 <w:rFonts w:eastAsiaTheme="minorEastAsia"/>
                 <w:smallCaps w:val="0"/>
                 <w:noProof/>
-                <w:kern w:val="2"/>
-                <w:sz w:val="24"/>
-                <w:szCs w:val="24"/>
-                <w:lang w:val="es-CL" w:eastAsia="es-MX"/>
-                <w14:ligatures w14:val="standardContextual"/>
+                <w:sz w:val="22"/>
+                <w:szCs w:val="22"/>
+                <w:lang w:val="es-CL" w:eastAsia="es-CL"/>
               </w:rPr>
               <w:tab/>
             </w:r>
@@ -1424,7 +1577,7 @@
                 <w:noProof/>
                 <w:webHidden/>
               </w:rPr>
-              <w:instrText xml:space="preserve"> PAGEREF _Toc241503862 \h </w:instrText>
+              <w:instrText xml:space="preserve"> PAGEREF _Toc241676047 \h </w:instrText>
             </w:r>
             <w:r>
               <w:rPr>
@@ -1444,7 +1597,7 @@
                 <w:noProof/>
                 <w:webHidden/>
               </w:rPr>
-              <w:t>4</w:t>
+              <w:t>5</w:t>
             </w:r>
             <w:r>
               <w:rPr>
@@ -1483,7 +1636,7 @@
         </w:rPr>
       </w:pPr>
       <w:bookmarkStart w:id="0" w:name="_Toc33411057"/>
-      <w:bookmarkStart w:id="1" w:name="_Toc241503854"/>
+      <w:bookmarkStart w:id="1" w:name="_Toc241676037"/>
       <w:r>
         <w:rPr>
           <w:rFonts w:asciiTheme="minorHAnsi" w:eastAsia="Times New Roman" w:hAnsiTheme="minorHAnsi" w:cstheme="minorHAnsi"/>
@@ -1658,8 +1811,7 @@
               <w:jc w:val="both"/>
               <w:rPr>
                 <w:rFonts w:asciiTheme="minorHAnsi" w:hAnsiTheme="minorHAnsi" w:cstheme="minorHAnsi"/>
-                <w:i/>
-                <w:color w:val="FF0000"/>
+                <w:iCs/>
                 <w:szCs w:val="24"/>
                 <w:lang w:val="es-ES" w:eastAsia="es-ES"/>
               </w:rPr>
@@ -1667,32 +1819,11 @@
             <w:r>
               <w:rPr>
                 <w:rFonts w:cstheme="minorHAnsi"/>
-                <w:i/>
-                <w:color w:val="FF0000"/>
+                <w:iCs/>
                 <w:szCs w:val="24"/>
                 <w:lang w:val="es-ES" w:eastAsia="es-ES"/>
               </w:rPr>
-              <w:fldChar w:fldCharType="begin"/>
-            </w:r>
-            <w:r>
-              <w:rPr>
-                <w:rFonts w:asciiTheme="minorHAnsi" w:hAnsiTheme="minorHAnsi" w:cstheme="minorHAnsi"/>
-                <w:i/>
-                <w:color w:val="FF0000"/>
-                <w:szCs w:val="24"/>
-                <w:lang w:val="es-ES" w:eastAsia="es-ES"/>
-              </w:rPr>
-              <w:instrText>MACROBUTTON NoMacro [Fecha]</w:instrText>
-            </w:r>
-            <w:r>
-              <w:rPr>
-                <w:rFonts w:cstheme="minorHAnsi"/>
-                <w:i/>
-                <w:color w:val="FF0000"/>
-                <w:szCs w:val="24"/>
-                <w:lang w:val="es-ES" w:eastAsia="es-ES"/>
-              </w:rPr>
-              <w:fldChar w:fldCharType="end"/>
+              <w:t>28-09-2026</w:t>
             </w:r>
           </w:p>
         </w:tc>
@@ -1706,8 +1837,7 @@
               <w:jc w:val="both"/>
               <w:rPr>
                 <w:rFonts w:asciiTheme="minorHAnsi" w:hAnsiTheme="minorHAnsi" w:cstheme="minorHAnsi"/>
-                <w:i/>
-                <w:color w:val="FF0000"/>
+                <w:iCs/>
                 <w:szCs w:val="24"/>
                 <w:lang w:val="es-ES" w:eastAsia="es-ES"/>
               </w:rPr>
@@ -1715,32 +1845,11 @@
             <w:r>
               <w:rPr>
                 <w:rFonts w:cstheme="minorHAnsi"/>
-                <w:i/>
-                <w:color w:val="FF0000"/>
+                <w:iCs/>
                 <w:szCs w:val="24"/>
                 <w:lang w:val="es-ES" w:eastAsia="es-ES"/>
               </w:rPr>
-              <w:fldChar w:fldCharType="begin"/>
-            </w:r>
-            <w:r>
-              <w:rPr>
-                <w:rFonts w:asciiTheme="minorHAnsi" w:hAnsiTheme="minorHAnsi" w:cstheme="minorHAnsi"/>
-                <w:i/>
-                <w:color w:val="FF0000"/>
-                <w:szCs w:val="24"/>
-                <w:lang w:val="es-ES" w:eastAsia="es-ES"/>
-              </w:rPr>
-              <w:instrText>MACROBUTTON NoMacro [Rev]</w:instrText>
-            </w:r>
-            <w:r>
-              <w:rPr>
-                <w:rFonts w:cstheme="minorHAnsi"/>
-                <w:i/>
-                <w:color w:val="FF0000"/>
-                <w:szCs w:val="24"/>
-                <w:lang w:val="es-ES" w:eastAsia="es-ES"/>
-              </w:rPr>
-              <w:fldChar w:fldCharType="end"/>
+              <w:t>1.0</w:t>
             </w:r>
           </w:p>
         </w:tc>
@@ -1753,9 +1862,8 @@
             <w:pPr>
               <w:jc w:val="both"/>
               <w:rPr>
-                <w:rFonts w:asciiTheme="minorHAnsi" w:hAnsiTheme="minorHAnsi" w:cstheme="minorHAnsi"/>
-                <w:i/>
-                <w:color w:val="FF0000"/>
+                <w:rFonts w:cstheme="minorHAnsi"/>
+                <w:iCs/>
                 <w:szCs w:val="24"/>
                 <w:lang w:val="es-ES" w:eastAsia="es-ES"/>
               </w:rPr>
@@ -1763,32 +1871,31 @@
             <w:r>
               <w:rPr>
                 <w:rFonts w:cstheme="minorHAnsi"/>
-                <w:i/>
-                <w:color w:val="FF0000"/>
+                <w:iCs/>
                 <w:szCs w:val="24"/>
                 <w:lang w:val="es-ES" w:eastAsia="es-ES"/>
               </w:rPr>
-              <w:fldChar w:fldCharType="begin"/>
-            </w:r>
-            <w:r>
+              <w:t>Alex Mauricio Puebla Allendes</w:t>
+            </w:r>
+          </w:p>
+          <w:p>
+            <w:pPr>
+              <w:jc w:val="both"/>
               <w:rPr>
                 <w:rFonts w:asciiTheme="minorHAnsi" w:hAnsiTheme="minorHAnsi" w:cstheme="minorHAnsi"/>
-                <w:i/>
-                <w:color w:val="FF0000"/>
+                <w:iCs/>
                 <w:szCs w:val="24"/>
                 <w:lang w:val="es-ES" w:eastAsia="es-ES"/>
               </w:rPr>
-              <w:instrText>MACROBUTTON NoMacro [Descripcion]</w:instrText>
-            </w:r>
+            </w:pPr>
             <w:r>
               <w:rPr>
                 <w:rFonts w:cstheme="minorHAnsi"/>
-                <w:i/>
-                <w:color w:val="FF0000"/>
+                <w:iCs/>
                 <w:szCs w:val="24"/>
                 <w:lang w:val="es-ES" w:eastAsia="es-ES"/>
               </w:rPr>
-              <w:fldChar w:fldCharType="end"/>
+              <w:t>José Ignacio Valdivia Mendoza</w:t>
             </w:r>
           </w:p>
         </w:tc>
@@ -1802,8 +1909,7 @@
               <w:jc w:val="both"/>
               <w:rPr>
                 <w:rFonts w:asciiTheme="minorHAnsi" w:hAnsiTheme="minorHAnsi" w:cstheme="minorHAnsi"/>
-                <w:i/>
-                <w:color w:val="FF0000"/>
+                <w:iCs/>
                 <w:szCs w:val="24"/>
                 <w:lang w:val="es-ES" w:eastAsia="es-ES"/>
               </w:rPr>
@@ -1811,32 +1917,11 @@
             <w:r>
               <w:rPr>
                 <w:rFonts w:cstheme="minorHAnsi"/>
-                <w:i/>
-                <w:color w:val="FF0000"/>
+                <w:iCs/>
                 <w:szCs w:val="24"/>
                 <w:lang w:val="es-ES" w:eastAsia="es-ES"/>
               </w:rPr>
-              <w:fldChar w:fldCharType="begin"/>
-            </w:r>
-            <w:r>
-              <w:rPr>
-                <w:rFonts w:asciiTheme="minorHAnsi" w:hAnsiTheme="minorHAnsi" w:cstheme="minorHAnsi"/>
-                <w:i/>
-                <w:color w:val="FF0000"/>
-                <w:szCs w:val="24"/>
-                <w:lang w:val="es-ES" w:eastAsia="es-ES"/>
-              </w:rPr>
-              <w:instrText>MACROBUTTON NoMacro [Descripcion]</w:instrText>
-            </w:r>
-            <w:r>
-              <w:rPr>
-                <w:rFonts w:cstheme="minorHAnsi"/>
-                <w:i/>
-                <w:color w:val="FF0000"/>
-                <w:szCs w:val="24"/>
-                <w:lang w:val="es-ES" w:eastAsia="es-ES"/>
-              </w:rPr>
-              <w:fldChar w:fldCharType="end"/>
+              <w:t>Inicio Documentación Nueva</w:t>
             </w:r>
           </w:p>
         </w:tc>
@@ -1855,8 +1940,7 @@
               <w:jc w:val="both"/>
               <w:rPr>
                 <w:rFonts w:asciiTheme="minorHAnsi" w:hAnsiTheme="minorHAnsi" w:cstheme="minorHAnsi"/>
-                <w:i/>
-                <w:color w:val="FF0000"/>
+                <w:iCs/>
                 <w:szCs w:val="24"/>
                 <w:lang w:val="es-ES" w:eastAsia="es-ES"/>
               </w:rPr>
@@ -1864,32 +1948,11 @@
             <w:r>
               <w:rPr>
                 <w:rFonts w:cstheme="minorHAnsi"/>
-                <w:i/>
-                <w:color w:val="FF0000"/>
+                <w:iCs/>
                 <w:szCs w:val="24"/>
                 <w:lang w:val="es-ES" w:eastAsia="es-ES"/>
               </w:rPr>
-              <w:fldChar w:fldCharType="begin"/>
-            </w:r>
-            <w:r>
-              <w:rPr>
-                <w:rFonts w:asciiTheme="minorHAnsi" w:hAnsiTheme="minorHAnsi" w:cstheme="minorHAnsi"/>
-                <w:i/>
-                <w:color w:val="FF0000"/>
-                <w:szCs w:val="24"/>
-                <w:lang w:val="es-ES" w:eastAsia="es-ES"/>
-              </w:rPr>
-              <w:instrText>MACROBUTTON NoMacro [Fecha]</w:instrText>
-            </w:r>
-            <w:r>
-              <w:rPr>
-                <w:rFonts w:cstheme="minorHAnsi"/>
-                <w:i/>
-                <w:color w:val="FF0000"/>
-                <w:szCs w:val="24"/>
-                <w:lang w:val="es-ES" w:eastAsia="es-ES"/>
-              </w:rPr>
-              <w:fldChar w:fldCharType="end"/>
+              <w:t>30-09-2026</w:t>
             </w:r>
           </w:p>
         </w:tc>
@@ -1903,8 +1966,7 @@
               <w:jc w:val="both"/>
               <w:rPr>
                 <w:rFonts w:asciiTheme="minorHAnsi" w:hAnsiTheme="minorHAnsi" w:cstheme="minorHAnsi"/>
-                <w:i/>
-                <w:color w:val="FF0000"/>
+                <w:iCs/>
                 <w:szCs w:val="24"/>
                 <w:lang w:val="es-ES" w:eastAsia="es-ES"/>
               </w:rPr>
@@ -1912,32 +1974,11 @@
             <w:r>
               <w:rPr>
                 <w:rFonts w:cstheme="minorHAnsi"/>
-                <w:i/>
-                <w:color w:val="FF0000"/>
+                <w:iCs/>
                 <w:szCs w:val="24"/>
                 <w:lang w:val="es-ES" w:eastAsia="es-ES"/>
               </w:rPr>
-              <w:fldChar w:fldCharType="begin"/>
-            </w:r>
-            <w:r>
-              <w:rPr>
-                <w:rFonts w:asciiTheme="minorHAnsi" w:hAnsiTheme="minorHAnsi" w:cstheme="minorHAnsi"/>
-                <w:i/>
-                <w:color w:val="FF0000"/>
-                <w:szCs w:val="24"/>
-                <w:lang w:val="es-ES" w:eastAsia="es-ES"/>
-              </w:rPr>
-              <w:instrText>MACROBUTTON NoMacro [Rev]</w:instrText>
-            </w:r>
-            <w:r>
-              <w:rPr>
-                <w:rFonts w:cstheme="minorHAnsi"/>
-                <w:i/>
-                <w:color w:val="FF0000"/>
-                <w:szCs w:val="24"/>
-                <w:lang w:val="es-ES" w:eastAsia="es-ES"/>
-              </w:rPr>
-              <w:fldChar w:fldCharType="end"/>
+              <w:t>1.1</w:t>
             </w:r>
           </w:p>
         </w:tc>
@@ -1951,8 +1992,7 @@
               <w:jc w:val="both"/>
               <w:rPr>
                 <w:rFonts w:asciiTheme="minorHAnsi" w:hAnsiTheme="minorHAnsi" w:cstheme="minorHAnsi"/>
-                <w:i/>
-                <w:color w:val="FF0000"/>
+                <w:iCs/>
                 <w:szCs w:val="24"/>
                 <w:lang w:val="es-ES" w:eastAsia="es-ES"/>
               </w:rPr>
@@ -1960,32 +2000,11 @@
             <w:r>
               <w:rPr>
                 <w:rFonts w:cstheme="minorHAnsi"/>
-                <w:i/>
-                <w:color w:val="FF0000"/>
+                <w:iCs/>
                 <w:szCs w:val="24"/>
                 <w:lang w:val="es-ES" w:eastAsia="es-ES"/>
               </w:rPr>
-              <w:fldChar w:fldCharType="begin"/>
-            </w:r>
-            <w:r>
-              <w:rPr>
-                <w:rFonts w:asciiTheme="minorHAnsi" w:hAnsiTheme="minorHAnsi" w:cstheme="minorHAnsi"/>
-                <w:i/>
-                <w:color w:val="FF0000"/>
-                <w:szCs w:val="24"/>
-                <w:lang w:val="es-ES" w:eastAsia="es-ES"/>
-              </w:rPr>
-              <w:instrText>MACROBUTTON NoMacro [Descripcion]</w:instrText>
-            </w:r>
-            <w:r>
-              <w:rPr>
-                <w:rFonts w:cstheme="minorHAnsi"/>
-                <w:i/>
-                <w:color w:val="FF0000"/>
-                <w:szCs w:val="24"/>
-                <w:lang w:val="es-ES" w:eastAsia="es-ES"/>
-              </w:rPr>
-              <w:fldChar w:fldCharType="end"/>
+              <w:t>Alex Mauricio Puebla Allendes</w:t>
             </w:r>
           </w:p>
         </w:tc>
@@ -1999,8 +2018,7 @@
               <w:jc w:val="both"/>
               <w:rPr>
                 <w:rFonts w:asciiTheme="minorHAnsi" w:hAnsiTheme="minorHAnsi" w:cstheme="minorHAnsi"/>
-                <w:i/>
-                <w:color w:val="FF0000"/>
+                <w:iCs/>
                 <w:szCs w:val="24"/>
                 <w:lang w:val="es-ES" w:eastAsia="es-ES"/>
               </w:rPr>
@@ -2008,32 +2026,11 @@
             <w:r>
               <w:rPr>
                 <w:rFonts w:cstheme="minorHAnsi"/>
-                <w:i/>
-                <w:color w:val="FF0000"/>
+                <w:iCs/>
                 <w:szCs w:val="24"/>
                 <w:lang w:val="es-ES" w:eastAsia="es-ES"/>
               </w:rPr>
-              <w:fldChar w:fldCharType="begin"/>
-            </w:r>
-            <w:r>
-              <w:rPr>
-                <w:rFonts w:asciiTheme="minorHAnsi" w:hAnsiTheme="minorHAnsi" w:cstheme="minorHAnsi"/>
-                <w:i/>
-                <w:color w:val="FF0000"/>
-                <w:szCs w:val="24"/>
-                <w:lang w:val="es-ES" w:eastAsia="es-ES"/>
-              </w:rPr>
-              <w:instrText>MACROBUTTON NoMacro [Descripcion]</w:instrText>
-            </w:r>
-            <w:r>
-              <w:rPr>
-                <w:rFonts w:cstheme="minorHAnsi"/>
-                <w:i/>
-                <w:color w:val="FF0000"/>
-                <w:szCs w:val="24"/>
-                <w:lang w:val="es-ES" w:eastAsia="es-ES"/>
-              </w:rPr>
-              <w:fldChar w:fldCharType="end"/>
+              <w:t>Avance Informe - Usuarios</w:t>
             </w:r>
           </w:p>
         </w:tc>
@@ -2083,6 +2080,123 @@
           <w:rFonts w:eastAsia="Times New Roman" w:cstheme="minorHAnsi"/>
           <w:sz w:val="20"/>
           <w:szCs w:val="24"/>
+          <w:lang w:val="fr-FR" w:eastAsia="es-ES"/>
+        </w:rPr>
+      </w:pPr>
+    </w:p>
+    <w:p>
+      <w:pPr>
+        <w:spacing w:after="0" w:line="240" w:lineRule="auto"/>
+        <w:jc w:val="both"/>
+        <w:rPr>
+          <w:rFonts w:eastAsia="Times New Roman" w:cstheme="minorHAnsi"/>
+          <w:sz w:val="20"/>
+          <w:szCs w:val="24"/>
+          <w:lang w:val="fr-FR" w:eastAsia="es-ES"/>
+        </w:rPr>
+      </w:pPr>
+    </w:p>
+    <w:p>
+      <w:pPr>
+        <w:spacing w:after="0" w:line="240" w:lineRule="auto"/>
+        <w:jc w:val="both"/>
+        <w:rPr>
+          <w:rFonts w:eastAsia="Times New Roman" w:cstheme="minorHAnsi"/>
+          <w:sz w:val="20"/>
+          <w:szCs w:val="24"/>
+          <w:lang w:val="fr-FR" w:eastAsia="es-ES"/>
+        </w:rPr>
+      </w:pPr>
+    </w:p>
+    <w:p>
+      <w:pPr>
+        <w:spacing w:after="0" w:line="240" w:lineRule="auto"/>
+        <w:jc w:val="both"/>
+        <w:rPr>
+          <w:rFonts w:eastAsia="Times New Roman" w:cstheme="minorHAnsi"/>
+          <w:sz w:val="20"/>
+          <w:szCs w:val="24"/>
+          <w:lang w:val="fr-FR" w:eastAsia="es-ES"/>
+        </w:rPr>
+      </w:pPr>
+    </w:p>
+    <w:p>
+      <w:pPr>
+        <w:spacing w:after="0" w:line="240" w:lineRule="auto"/>
+        <w:jc w:val="both"/>
+        <w:rPr>
+          <w:rFonts w:eastAsia="Times New Roman" w:cstheme="minorHAnsi"/>
+          <w:sz w:val="20"/>
+          <w:szCs w:val="24"/>
+          <w:lang w:val="fr-FR" w:eastAsia="es-ES"/>
+        </w:rPr>
+      </w:pPr>
+    </w:p>
+    <w:p>
+      <w:pPr>
+        <w:spacing w:after="0" w:line="240" w:lineRule="auto"/>
+        <w:jc w:val="both"/>
+        <w:rPr>
+          <w:rFonts w:eastAsia="Times New Roman" w:cstheme="minorHAnsi"/>
+          <w:sz w:val="20"/>
+          <w:szCs w:val="24"/>
+          <w:lang w:val="fr-FR" w:eastAsia="es-ES"/>
+        </w:rPr>
+      </w:pPr>
+    </w:p>
+    <w:p>
+      <w:pPr>
+        <w:spacing w:after="0" w:line="240" w:lineRule="auto"/>
+        <w:jc w:val="both"/>
+        <w:rPr>
+          <w:rFonts w:eastAsia="Times New Roman" w:cstheme="minorHAnsi"/>
+          <w:sz w:val="20"/>
+          <w:szCs w:val="24"/>
+          <w:lang w:val="fr-FR" w:eastAsia="es-ES"/>
+        </w:rPr>
+      </w:pPr>
+    </w:p>
+    <w:p>
+      <w:pPr>
+        <w:spacing w:after="0" w:line="240" w:lineRule="auto"/>
+        <w:jc w:val="both"/>
+        <w:rPr>
+          <w:rFonts w:eastAsia="Times New Roman" w:cstheme="minorHAnsi"/>
+          <w:sz w:val="20"/>
+          <w:szCs w:val="24"/>
+          <w:lang w:val="fr-FR" w:eastAsia="es-ES"/>
+        </w:rPr>
+      </w:pPr>
+    </w:p>
+    <w:p>
+      <w:pPr>
+        <w:spacing w:after="0" w:line="240" w:lineRule="auto"/>
+        <w:jc w:val="both"/>
+        <w:rPr>
+          <w:rFonts w:eastAsia="Times New Roman" w:cstheme="minorHAnsi"/>
+          <w:sz w:val="20"/>
+          <w:szCs w:val="24"/>
+          <w:lang w:val="fr-FR" w:eastAsia="es-ES"/>
+        </w:rPr>
+      </w:pPr>
+      <w:r>
+        <w:rPr>
+          <w:rFonts w:eastAsia="Times New Roman" w:cstheme="minorHAnsi"/>
+          <w:sz w:val="20"/>
+          <w:szCs w:val="24"/>
+          <w:lang w:val="fr-FR" w:eastAsia="es-ES"/>
+        </w:rPr>
+        <w:t xml:space="preserve"> </w:t>
+      </w:r>
+    </w:p>
+    <w:p>
+      <w:pPr>
+        <w:spacing w:after="0" w:line="240" w:lineRule="auto"/>
+        <w:jc w:val="both"/>
+        <w:rPr>
+          <w:rFonts w:eastAsia="Times New Roman" w:cstheme="minorHAnsi"/>
+          <w:sz w:val="20"/>
+          <w:szCs w:val="24"/>
           <w:lang w:val="es-ES" w:eastAsia="es-ES"/>
         </w:rPr>
       </w:pPr>
@@ -2166,7 +2280,7 @@
       <w:pPr>
         <w:pStyle w:val="Ttulo1"/>
       </w:pPr>
-      <w:bookmarkStart w:id="2" w:name="_Toc241503855"/>
+      <w:bookmarkStart w:id="2" w:name="_Toc241676038"/>
       <w:r>
         <w:t>Integrantes:</w:t>
       </w:r>
@@ -2255,14 +2369,23 @@
           </w:tcPr>
           <w:p>
             <w:pPr>
-              <w:jc w:val="both"/>
-              <w:rPr>
-                <w:rFonts w:asciiTheme="minorHAnsi" w:hAnsiTheme="minorHAnsi" w:cstheme="minorHAnsi"/>
-                <w:i/>
+              <w:jc w:val="center"/>
+              <w:rPr>
+                <w:rFonts w:cstheme="minorHAnsi"/>
+                <w:iCs/>
                 <w:szCs w:val="24"/>
                 <w:lang w:val="es-ES" w:eastAsia="es-ES"/>
               </w:rPr>
             </w:pPr>
+            <w:r>
+              <w:rPr>
+                <w:rFonts w:cstheme="minorHAnsi"/>
+                <w:iCs/>
+                <w:szCs w:val="24"/>
+                <w:lang w:val="es-ES" w:eastAsia="es-ES"/>
+              </w:rPr>
+              <w:t>Alex Mauricio Puebla Allendes</w:t>
+            </w:r>
           </w:p>
         </w:tc>
         <w:tc>
@@ -2272,14 +2395,59 @@
           </w:tcPr>
           <w:p>
             <w:pPr>
-              <w:jc w:val="both"/>
+              <w:jc w:val="center"/>
               <w:rPr>
                 <w:rFonts w:asciiTheme="minorHAnsi" w:hAnsiTheme="minorHAnsi" w:cstheme="minorHAnsi"/>
                 <w:i/>
-                <w:szCs w:val="24"/>
+                <w:sz w:val="22"/>
+                <w:szCs w:val="22"/>
                 <w:lang w:val="es-ES" w:eastAsia="es-ES"/>
               </w:rPr>
             </w:pPr>
+            <w:r>
+              <w:rPr>
+                <w:rFonts w:asciiTheme="minorHAnsi" w:hAnsiTheme="minorHAnsi" w:cstheme="minorHAnsi"/>
+                <w:sz w:val="22"/>
+                <w:szCs w:val="22"/>
+              </w:rPr>
+              <w:t xml:space="preserve">QA </w:t>
+            </w:r>
+            <w:proofErr w:type="spellStart"/>
+            <w:r>
+              <w:rPr>
+                <w:rFonts w:asciiTheme="minorHAnsi" w:hAnsiTheme="minorHAnsi" w:cstheme="minorHAnsi"/>
+                <w:sz w:val="22"/>
+                <w:szCs w:val="22"/>
+              </w:rPr>
+              <w:t>Analyst</w:t>
+            </w:r>
+            <w:proofErr w:type="spellEnd"/>
+            <w:r>
+              <w:rPr>
+                <w:rFonts w:asciiTheme="minorHAnsi" w:hAnsiTheme="minorHAnsi" w:cstheme="minorHAnsi"/>
+                <w:sz w:val="22"/>
+                <w:szCs w:val="22"/>
+              </w:rPr>
+              <w:t xml:space="preserve"> &amp; Test </w:t>
+            </w:r>
+            <w:proofErr w:type="spellStart"/>
+            <w:r>
+              <w:rPr>
+                <w:rFonts w:asciiTheme="minorHAnsi" w:hAnsiTheme="minorHAnsi" w:cstheme="minorHAnsi"/>
+                <w:sz w:val="22"/>
+                <w:szCs w:val="22"/>
+              </w:rPr>
+              <w:t>Strategy</w:t>
+            </w:r>
+            <w:proofErr w:type="spellEnd"/>
+            <w:r>
+              <w:rPr>
+                <w:rFonts w:asciiTheme="minorHAnsi" w:hAnsiTheme="minorHAnsi" w:cstheme="minorHAnsi"/>
+                <w:sz w:val="22"/>
+                <w:szCs w:val="22"/>
+              </w:rPr>
+              <w:t xml:space="preserve"> Lead</w:t>
+            </w:r>
           </w:p>
         </w:tc>
       </w:tr>
@@ -2294,7 +2462,7 @@
           </w:tcPr>
           <w:p>
             <w:pPr>
-              <w:jc w:val="both"/>
+              <w:jc w:val="center"/>
               <w:rPr>
                 <w:rFonts w:cstheme="minorHAnsi"/>
                 <w:i/>
@@ -2302,6 +2470,15 @@
                 <w:lang w:val="es-ES" w:eastAsia="es-ES"/>
               </w:rPr>
             </w:pPr>
+            <w:r>
+              <w:rPr>
+                <w:rFonts w:cstheme="minorHAnsi"/>
+                <w:iCs/>
+                <w:szCs w:val="24"/>
+                <w:lang w:val="es-ES" w:eastAsia="es-ES"/>
+              </w:rPr>
+              <w:t>José Ignacio Valdivia Mendoza</w:t>
+            </w:r>
           </w:p>
         </w:tc>
         <w:tc>
@@ -2311,131 +2488,77 @@
           </w:tcPr>
           <w:p>
             <w:pPr>
-              <w:jc w:val="both"/>
-              <w:rPr>
-                <w:rFonts w:cstheme="minorHAnsi"/>
+              <w:jc w:val="center"/>
+              <w:rPr>
+                <w:rFonts w:asciiTheme="minorHAnsi" w:hAnsiTheme="minorHAnsi" w:cstheme="minorHAnsi"/>
                 <w:i/>
-                <w:szCs w:val="24"/>
+                <w:sz w:val="22"/>
+                <w:szCs w:val="22"/>
                 <w:lang w:val="es-ES" w:eastAsia="es-ES"/>
               </w:rPr>
             </w:pPr>
-          </w:p>
-        </w:tc>
-      </w:tr>
-      <w:tr>
-        <w:trPr>
-          <w:trHeight w:val="465"/>
-        </w:trPr>
-        <w:tc>
-          <w:tcPr>
-            <w:tcW w:w="3539" w:type="dxa"/>
-            <w:vAlign w:val="center"/>
-          </w:tcPr>
-          <w:p>
-            <w:pPr>
-              <w:jc w:val="both"/>
-              <w:rPr>
-                <w:rFonts w:cstheme="minorHAnsi"/>
-                <w:i/>
-                <w:szCs w:val="24"/>
-                <w:lang w:val="es-ES" w:eastAsia="es-ES"/>
-              </w:rPr>
-            </w:pPr>
-          </w:p>
-        </w:tc>
-        <w:tc>
-          <w:tcPr>
-            <w:tcW w:w="5275" w:type="dxa"/>
-            <w:vAlign w:val="center"/>
-          </w:tcPr>
-          <w:p>
-            <w:pPr>
-              <w:jc w:val="both"/>
-              <w:rPr>
-                <w:rFonts w:cstheme="minorHAnsi"/>
-                <w:i/>
-                <w:szCs w:val="24"/>
-                <w:lang w:val="es-ES" w:eastAsia="es-ES"/>
-              </w:rPr>
-            </w:pPr>
-          </w:p>
-        </w:tc>
-      </w:tr>
-      <w:tr>
-        <w:trPr>
-          <w:trHeight w:val="465"/>
-        </w:trPr>
-        <w:tc>
-          <w:tcPr>
-            <w:tcW w:w="3539" w:type="dxa"/>
-            <w:vAlign w:val="center"/>
-          </w:tcPr>
-          <w:p>
-            <w:pPr>
-              <w:jc w:val="both"/>
-              <w:rPr>
-                <w:rFonts w:cstheme="minorHAnsi"/>
-                <w:i/>
-                <w:szCs w:val="24"/>
-                <w:lang w:val="es-ES" w:eastAsia="es-ES"/>
-              </w:rPr>
-            </w:pPr>
-          </w:p>
-        </w:tc>
-        <w:tc>
-          <w:tcPr>
-            <w:tcW w:w="5275" w:type="dxa"/>
-            <w:vAlign w:val="center"/>
-          </w:tcPr>
-          <w:p>
-            <w:pPr>
-              <w:jc w:val="both"/>
-              <w:rPr>
-                <w:rFonts w:cstheme="minorHAnsi"/>
-                <w:i/>
-                <w:szCs w:val="24"/>
-                <w:lang w:val="es-ES" w:eastAsia="es-ES"/>
-              </w:rPr>
-            </w:pPr>
-          </w:p>
-        </w:tc>
-      </w:tr>
-      <w:tr>
-        <w:trPr>
-          <w:trHeight w:val="465"/>
-        </w:trPr>
-        <w:tc>
-          <w:tcPr>
-            <w:tcW w:w="3539" w:type="dxa"/>
-            <w:vAlign w:val="center"/>
-          </w:tcPr>
-          <w:p>
-            <w:pPr>
-              <w:jc w:val="both"/>
-              <w:rPr>
-                <w:rFonts w:cstheme="minorHAnsi"/>
-                <w:i/>
-                <w:szCs w:val="24"/>
-                <w:lang w:val="es-ES" w:eastAsia="es-ES"/>
-              </w:rPr>
-            </w:pPr>
-          </w:p>
-        </w:tc>
-        <w:tc>
-          <w:tcPr>
-            <w:tcW w:w="5275" w:type="dxa"/>
-            <w:vAlign w:val="center"/>
-          </w:tcPr>
-          <w:p>
-            <w:pPr>
-              <w:jc w:val="both"/>
-              <w:rPr>
-                <w:rFonts w:cstheme="minorHAnsi"/>
-                <w:i/>
-                <w:szCs w:val="24"/>
-                <w:lang w:val="es-ES" w:eastAsia="es-ES"/>
-              </w:rPr>
-            </w:pPr>
+            <w:r>
+              <w:rPr>
+                <w:rFonts w:asciiTheme="minorHAnsi" w:hAnsiTheme="minorHAnsi" w:cstheme="minorHAnsi"/>
+                <w:sz w:val="22"/>
+                <w:szCs w:val="22"/>
+              </w:rPr>
+              <w:t xml:space="preserve">QA </w:t>
+            </w:r>
+            <w:proofErr w:type="spellStart"/>
+            <w:r>
+              <w:rPr>
+                <w:rFonts w:asciiTheme="minorHAnsi" w:hAnsiTheme="minorHAnsi" w:cstheme="minorHAnsi"/>
+                <w:sz w:val="22"/>
+                <w:szCs w:val="22"/>
+              </w:rPr>
+              <w:t>Automation</w:t>
+            </w:r>
+            <w:proofErr w:type="spellEnd"/>
+            <w:r>
+              <w:rPr>
+                <w:rFonts w:asciiTheme="minorHAnsi" w:hAnsiTheme="minorHAnsi" w:cstheme="minorHAnsi"/>
+                <w:sz w:val="22"/>
+                <w:szCs w:val="22"/>
+              </w:rPr>
+              <w:t xml:space="preserve"> </w:t>
+            </w:r>
+            <w:proofErr w:type="spellStart"/>
+            <w:r>
+              <w:rPr>
+                <w:rFonts w:asciiTheme="minorHAnsi" w:hAnsiTheme="minorHAnsi" w:cstheme="minorHAnsi"/>
+                <w:sz w:val="22"/>
+                <w:szCs w:val="22"/>
+              </w:rPr>
+              <w:t>Engineer</w:t>
+            </w:r>
+            <w:proofErr w:type="spellEnd"/>
+            <w:r>
+              <w:rPr>
+                <w:rFonts w:asciiTheme="minorHAnsi" w:hAnsiTheme="minorHAnsi" w:cstheme="minorHAnsi"/>
+                <w:sz w:val="22"/>
+                <w:szCs w:val="22"/>
+              </w:rPr>
+              <w:t xml:space="preserve"> &amp; Cloud </w:t>
+            </w:r>
+            <w:proofErr w:type="spellStart"/>
+            <w:r>
+              <w:rPr>
+                <w:rFonts w:asciiTheme="minorHAnsi" w:hAnsiTheme="minorHAnsi" w:cstheme="minorHAnsi"/>
+                <w:sz w:val="22"/>
+                <w:szCs w:val="22"/>
+              </w:rPr>
+              <w:t>Infrastructure</w:t>
+            </w:r>
+            <w:proofErr w:type="spellEnd"/>
+            <w:r>
+              <w:rPr>
+                <w:rFonts w:asciiTheme="minorHAnsi" w:hAnsiTheme="minorHAnsi" w:cstheme="minorHAnsi"/>
+                <w:sz w:val="22"/>
+                <w:szCs w:val="22"/>
+              </w:rPr>
+              <w:t xml:space="preserve"> Lead</w:t>
+            </w:r>
           </w:p>
         </w:tc>
       </w:tr>
@@ -2468,7 +2591,7 @@
           <w:rFonts w:asciiTheme="minorHAnsi" w:hAnsiTheme="minorHAnsi" w:cstheme="minorHAnsi"/>
         </w:rPr>
       </w:pPr>
-      <w:bookmarkStart w:id="3" w:name="_Toc241503856"/>
+      <w:bookmarkStart w:id="3" w:name="_Toc241676039"/>
       <w:r>
         <w:rPr>
           <w:rFonts w:asciiTheme="minorHAnsi" w:hAnsiTheme="minorHAnsi" w:cstheme="minorHAnsi"/>
@@ -2486,7 +2609,7 @@
           <w:rFonts w:asciiTheme="minorHAnsi" w:hAnsiTheme="minorHAnsi" w:cstheme="minorHAnsi"/>
         </w:rPr>
       </w:pPr>
-      <w:bookmarkStart w:id="4" w:name="_Toc241503857"/>
+      <w:bookmarkStart w:id="4" w:name="_Toc241676040"/>
       <w:r>
         <w:rPr>
           <w:rFonts w:asciiTheme="minorHAnsi" w:hAnsiTheme="minorHAnsi" w:cstheme="minorHAnsi"/>
@@ -2496,15 +2619,110 @@
       <w:bookmarkEnd w:id="4"/>
     </w:p>
     <w:p>
+      <w:pPr>
+        <w:pStyle w:val="NormalWeb"/>
+        <w:rPr>
+          <w:rFonts w:asciiTheme="minorHAnsi" w:hAnsiTheme="minorHAnsi" w:cstheme="minorHAnsi"/>
+          <w:sz w:val="22"/>
+          <w:szCs w:val="22"/>
+        </w:rPr>
+      </w:pPr>
       <w:r>
-        <w:t>Expresar de manera concisa cual es el quiebre o problema a trabajar.  Establecer claramente cual es la situación actual y por qué representa un problema u oportunidad de mejora.</w:t>
+        <w:rPr>
+          <w:rFonts w:asciiTheme="minorHAnsi" w:hAnsiTheme="minorHAnsi" w:cstheme="minorHAnsi"/>
+          <w:sz w:val="22"/>
+          <w:szCs w:val="22"/>
+        </w:rPr>
+        <w:t>Hoy en día se generan muchas aplicaciones dinámicas o asincrónicas, pero la revisión de estas presenta un problema que podemos dividir en dos partes:</w:t>
       </w:r>
     </w:p>
     <w:p>
       <w:pPr>
+        <w:pStyle w:val="NormalWeb"/>
+        <w:numPr>
+          <w:ilvl w:val="0"/>
+          <w:numId w:val="15"/>
+        </w:numPr>
+        <w:rPr>
+          <w:rFonts w:asciiTheme="minorHAnsi" w:hAnsiTheme="minorHAnsi" w:cstheme="minorHAnsi"/>
+          <w:sz w:val="22"/>
+          <w:szCs w:val="22"/>
+        </w:rPr>
+      </w:pPr>
+      <w:r>
+        <w:rPr>
+          <w:rFonts w:asciiTheme="minorHAnsi" w:hAnsiTheme="minorHAnsi" w:cstheme="minorHAnsi"/>
+          <w:b/>
+          <w:bCs/>
+          <w:sz w:val="22"/>
+          <w:szCs w:val="22"/>
+        </w:rPr>
+        <w:t>Las pruebas manuales:</w:t>
+      </w:r>
+      <w:r>
+        <w:rPr>
+          <w:rFonts w:asciiTheme="minorHAnsi" w:hAnsiTheme="minorHAnsi" w:cstheme="minorHAnsi"/>
+          <w:sz w:val="22"/>
+          <w:szCs w:val="22"/>
+        </w:rPr>
+        <w:t xml:space="preserve"> son lentas y propensas a errores humanos.</w:t>
+      </w:r>
+    </w:p>
+    <w:p>
+      <w:pPr>
+        <w:pStyle w:val="NormalWeb"/>
+        <w:numPr>
+          <w:ilvl w:val="0"/>
+          <w:numId w:val="15"/>
+        </w:numPr>
+        <w:rPr>
+          <w:rFonts w:asciiTheme="minorHAnsi" w:hAnsiTheme="minorHAnsi" w:cstheme="minorHAnsi"/>
+          <w:sz w:val="22"/>
+          <w:szCs w:val="22"/>
+        </w:rPr>
+      </w:pPr>
+      <w:r>
+        <w:rPr>
+          <w:rFonts w:asciiTheme="minorHAnsi" w:hAnsiTheme="minorHAnsi" w:cstheme="minorHAnsi"/>
+          <w:b/>
+          <w:bCs/>
+          <w:sz w:val="22"/>
+          <w:szCs w:val="22"/>
+        </w:rPr>
+        <w:t>La automatización tradicional:</w:t>
+      </w:r>
+      <w:r>
+        <w:rPr>
+          <w:rFonts w:asciiTheme="minorHAnsi" w:hAnsiTheme="minorHAnsi" w:cstheme="minorHAnsi"/>
+          <w:sz w:val="22"/>
+          <w:szCs w:val="22"/>
+        </w:rPr>
+        <w:t xml:space="preserve"> obliga a usar programas complejos, escribiendo código específico para probar cada botón o función.</w:t>
+      </w:r>
+    </w:p>
+    <w:p>
+      <w:pPr>
+        <w:pStyle w:val="NormalWeb"/>
+        <w:rPr>
+          <w:rFonts w:asciiTheme="minorHAnsi" w:hAnsiTheme="minorHAnsi" w:cstheme="minorHAnsi"/>
+          <w:sz w:val="22"/>
+          <w:szCs w:val="22"/>
+        </w:rPr>
+      </w:pPr>
+      <w:r>
+        <w:rPr>
+          <w:rFonts w:asciiTheme="minorHAnsi" w:hAnsiTheme="minorHAnsi" w:cstheme="minorHAnsi"/>
+          <w:sz w:val="22"/>
+          <w:szCs w:val="22"/>
+        </w:rPr>
+        <w:t>Ambos enfoques quitan tiempo, generan mayores gastos y, en muchos casos, necesitan de conocimientos avanzados. Como resultado, las revisiones generan atrasos que se van comiendo el tiempo del proyecto y, por ende, muchas aplicaciones terminan saliendo a producción sin ser probadas debidamente.</w:t>
+      </w:r>
+    </w:p>
+    <w:p>
+      <w:pPr>
         <w:pStyle w:val="Ttulo2"/>
       </w:pPr>
-      <w:bookmarkStart w:id="5" w:name="_Toc241503858"/>
+      <w:bookmarkStart w:id="5" w:name="_Toc241676041"/>
       <w:r>
         <w:t>Usuarios</w:t>
       </w:r>
@@ -2514,9 +2732,9 @@
       <w:pPr>
         <w:pStyle w:val="Ttulo3"/>
       </w:pPr>
-      <w:bookmarkStart w:id="6" w:name="_Toc241503859"/>
+      <w:bookmarkStart w:id="6" w:name="_Toc241676042"/>
       <w:r>
-        <w:t>Usuario 1</w:t>
+        <w:t>Usuario Normal/Dueño sitio web</w:t>
       </w:r>
       <w:bookmarkEnd w:id="6"/>
     </w:p>
@@ -2538,7 +2756,7 @@
         <w:rPr>
           <w:lang w:val="es-ES" w:eastAsia="es-ES"/>
         </w:rPr>
-        <w:t>Detalle del conjunto demográfico o especifico que define el conjunto de usuarios agrupado a este punto.</w:t>
+        <w:t>Cualquier persona que sea dueño de una tienda en línea, emprendedores de PYME o dueños de una página web, etc. Quienes saben poco o nada sobre programación o informática. Pero que dependan de que su aplicación funcione correctamente.</w:t>
       </w:r>
     </w:p>
     <w:p>
@@ -2565,16 +2783,16 @@
         <w:rPr>
           <w:lang w:val="es-ES" w:eastAsia="es-ES"/>
         </w:rPr>
-        <w:t>Explicitar que problemas o necesidades tiene este conjunto de usuarios.</w:t>
+        <w:t>Al no saber sobre programación no se entera de si funciona o no hasta que un cliente reporta el problema, necesitando un sistema extremadamente simple que le indique si su sitio web esta sano y operativo, sin la necesidad de pagar por un servicio que lo único que realizara es una revisión de rutina.</w:t>
       </w:r>
     </w:p>
     <w:p>
       <w:pPr>
         <w:pStyle w:val="Ttulo3"/>
       </w:pPr>
-      <w:bookmarkStart w:id="7" w:name="_Toc241503860"/>
+      <w:bookmarkStart w:id="7" w:name="_Toc241676043"/>
       <w:r>
-        <w:t>Usuario 1</w:t>
+        <w:t>Analista QA Manual</w:t>
       </w:r>
       <w:bookmarkEnd w:id="7"/>
     </w:p>
@@ -2596,7 +2814,7 @@
         <w:rPr>
           <w:lang w:val="es-ES" w:eastAsia="es-ES"/>
         </w:rPr>
-        <w:t>Detalle del conjunto demográfico o especifico que define el conjunto de usuarios agrupado a este punto.</w:t>
+        <w:t>Conocedor del proceso de como se realizan las pruebas y el correcto funcionamiento de las páginas web, pero quien hace las pruebas navegando y haciendo clics de manera manual porque no sabe escribir código para automatizar.</w:t>
       </w:r>
     </w:p>
     <w:p>
@@ -2623,18 +2841,27 @@
         <w:rPr>
           <w:lang w:val="es-ES" w:eastAsia="es-ES"/>
         </w:rPr>
-        <w:t>Explicitar que problemas o necesidades tiene este conjunto de usuarios.</w:t>
+        <w:t>Al perder muchas horas haciendo tareas repetitivas cada vez que existe una nueva actualización. Necesita una forma de automatizar las revisiones básicas, como la carga de imágenes, funcionamiento de los enlaces entre otros, sin la necesidad de aprender otro lenguaje de programación más complejo, lo que le permitirá tener tiempo extra en búsqueda de errores más difíciles de detectar o solucionar.</w:t>
       </w:r>
     </w:p>
     <w:p>
       <w:pPr>
         <w:pStyle w:val="Ttulo3"/>
       </w:pPr>
-      <w:bookmarkStart w:id="8" w:name="_Toc241503861"/>
+      <w:bookmarkStart w:id="8" w:name="_Toc241676044"/>
       <w:r>
-        <w:t>Usuario 1</w:t>
+        <w:lastRenderedPageBreak/>
+        <w:t xml:space="preserve">Desarrollador </w:t>
       </w:r>
       <w:bookmarkEnd w:id="8"/>
+      <w:r>
+        <w:t>Front-</w:t>
+      </w:r>
+      <w:proofErr w:type="spellStart"/>
+      <w:r>
+        <w:t>End</w:t>
+      </w:r>
+      <w:proofErr w:type="spellEnd"/>
     </w:p>
     <w:p>
       <w:pPr>
@@ -2654,7 +2881,7 @@
         <w:rPr>
           <w:lang w:val="es-ES" w:eastAsia="es-ES"/>
         </w:rPr>
-        <w:t>Detalle del conjunto demográfico o especifico que define el conjunto de usuarios agrupado a este punto.</w:t>
+        <w:t>Programador que construye parte visual de la página. Trabajando con intervalos de tiempos de entrega cortos y constantes mientras sube código nuevo.</w:t>
       </w:r>
     </w:p>
     <w:p>
@@ -2681,31 +2908,149 @@
         <w:rPr>
           <w:lang w:val="es-ES" w:eastAsia="es-ES"/>
         </w:rPr>
-        <w:t>Explicitar que problemas o necesidades tiene este conjunto de usuarios.</w:t>
+        <w:t>Necesita una herramienta que sea rápida al revisar toda la página cada vez que se realiza un cambio podemos cumplir esta función de manera automática, sin necesidad de configuraciones extras o adicionales. Porque el mayor problema surge que cada vez que arregla una parte de la pagina sin querer otra cosa deja de funcionar.</w:t>
       </w:r>
     </w:p>
     <w:p>
       <w:pPr>
-        <w:rPr>
-          <w:lang w:val="es-ES" w:eastAsia="es-ES"/>
-        </w:rPr>
-      </w:pPr>
+        <w:pStyle w:val="Ttulo3"/>
+      </w:pPr>
+      <w:bookmarkStart w:id="9" w:name="_Toc241676045"/>
+      <w:r>
+        <w:t>Dueño del producto</w:t>
+      </w:r>
+      <w:bookmarkEnd w:id="9"/>
+      <w:r>
+        <w:t>/</w:t>
+      </w:r>
+      <w:proofErr w:type="spellStart"/>
+      <w:r>
+        <w:t>Stakeholder</w:t>
+      </w:r>
+      <w:proofErr w:type="spellEnd"/>
     </w:p>
     <w:p>
       <w:pPr>
+        <w:pStyle w:val="Ttulo4"/>
+      </w:pPr>
+      <w:r>
+        <w:t>Determinación del usuario</w:t>
+      </w:r>
+    </w:p>
+    <w:p>
+      <w:r>
+        <w:t>Representa a los tomadores de decisiones del proyecto. En el contexto académico, este rol abarca al docente guía y a la comisión evaluadora, quienes actúan como validadores de su valor real. A escala de mercado, representa a los futuros líderes de negocio o clientes que adoptarán esta herramienta.</w:t>
+      </w:r>
+    </w:p>
+    <w:p>
+      <w:pPr>
+        <w:pStyle w:val="Ttulo4"/>
+        <w:rPr>
+          <w:lang w:val="es-ES" w:eastAsia="es-ES"/>
+        </w:rPr>
+      </w:pPr>
+      <w:r>
+        <w:rPr>
+          <w:lang w:val="es-ES" w:eastAsia="es-ES"/>
+        </w:rPr>
+        <w:t>Necesidades de los usuarios</w:t>
+      </w:r>
+    </w:p>
+    <w:p>
+      <w:pPr>
+        <w:rPr>
+          <w:lang w:val="es-ES" w:eastAsia="es-ES"/>
+        </w:rPr>
+      </w:pPr>
+      <w:r>
+        <w:t>Necesita validar y verificar que el producto entregue un valor real y solucione el problema en concreto, requiriendo evidencia tangible y reportes que solidifiquen su funcionalidad, todo esto sin la necesidad de conocer los detalles de programación subyacentes.</w:t>
+      </w:r>
+    </w:p>
+    <w:p>
+      <w:pPr>
+        <w:pStyle w:val="Ttulo3"/>
+      </w:pPr>
+      <w:r>
+        <w:t>Auditor de calidad o especialista en ciberseguridad</w:t>
+      </w:r>
+    </w:p>
+    <w:p>
+      <w:pPr>
+        <w:pStyle w:val="Ttulo4"/>
+      </w:pPr>
+      <w:r>
+        <w:t>Determinación del usuario</w:t>
+      </w:r>
+    </w:p>
+    <w:p>
+      <w:pPr>
+        <w:rPr>
+          <w:lang w:val="es-ES" w:eastAsia="es-ES"/>
+        </w:rPr>
+      </w:pPr>
+      <w:r>
+        <w:rPr>
+          <w:lang w:val="es-ES" w:eastAsia="es-ES"/>
+        </w:rPr>
+        <w:t>Profesionales que auditan y revisan la seguridad de las paginas web buscando fallos críticos, vulnerabilidades estructurales o procesos mal hechos.</w:t>
+      </w:r>
+    </w:p>
+    <w:p>
+      <w:pPr>
+        <w:pStyle w:val="Ttulo4"/>
+        <w:rPr>
+          <w:lang w:val="es-ES" w:eastAsia="es-ES"/>
+        </w:rPr>
+      </w:pPr>
+      <w:r>
+        <w:rPr>
+          <w:lang w:val="es-ES" w:eastAsia="es-ES"/>
+        </w:rPr>
+        <w:t>Necesidades de los usuarios</w:t>
+      </w:r>
+    </w:p>
+    <w:p>
+      <w:pPr>
+        <w:rPr>
+          <w:lang w:val="es-ES" w:eastAsia="es-ES"/>
+        </w:rPr>
+      </w:pPr>
+      <w:r>
+        <w:rPr>
+          <w:lang w:val="es-ES" w:eastAsia="es-ES"/>
+        </w:rPr>
+        <w:t>Actualmente, mapear todo lo que tiene una pagina web, como lo son formularios, botones y distintos elementos toma demasiado tiempo si se le hace a mano. Necesitando como solución que una herramienta escanee toda la estructura visual de cualquier sitio web de forma rápida o inmediata para detectar áreas frágiles o errores internos que puedan presentar un riesgo.</w:t>
+      </w:r>
+    </w:p>
+    <w:p>
+      <w:pPr>
+        <w:rPr>
+          <w:lang w:val="es-ES" w:eastAsia="es-ES"/>
+        </w:rPr>
+      </w:pPr>
+    </w:p>
+    <w:p>
+      <w:pPr>
+        <w:rPr>
+          <w:lang w:val="es-ES" w:eastAsia="es-ES"/>
+        </w:rPr>
+      </w:pPr>
+    </w:p>
+    <w:p>
+      <w:pPr>
         <w:pStyle w:val="Ttulo2"/>
         <w:rPr>
           <w:lang w:val="es-ES" w:eastAsia="es-ES"/>
         </w:rPr>
       </w:pPr>
-      <w:bookmarkStart w:id="9" w:name="_Toc241503862"/>
+      <w:bookmarkStart w:id="10" w:name="_Toc241676047"/>
       <w:r>
         <w:rPr>
           <w:lang w:val="es-ES" w:eastAsia="es-ES"/>
         </w:rPr>
         <w:t>Propuesta de Valor</w:t>
       </w:r>
-      <w:bookmarkEnd w:id="9"/>
+      <w:bookmarkEnd w:id="10"/>
     </w:p>
     <w:p>
       <w:pPr>
@@ -2748,7 +3093,7 @@
 </file>
 
 <file path=word/endnotes.xml><?xml version="1.0" encoding="utf-8"?>
-<w:endnotes xmlns:wpc="http://schemas.microsoft.com/office/word/2010/wordprocessingCanvas" xmlns:cx="http://schemas.microsoft.com/office/drawing/2014/chartex" xmlns:cx1="http://schemas.microsoft.com/office/drawing/2015/9/8/chartex" xmlns:cx2="http://schemas.microsoft.com/office/drawing/2015/10/21/chartex" xmlns:cx3="http://schemas.microsoft.com/office/drawing/2016/5/9/chartex" xmlns:cx4="http://schemas.microsoft.com/office/drawing/2016/5/10/chartex" xmlns:cx5="http://schemas.microsoft.com/office/drawing/2016/5/11/chartex" xmlns:cx6="http://schemas.microsoft.com/office/drawing/2016/5/12/chartex" xmlns:cx7="http://schemas.microsoft.com/office/drawing/2016/5/13/chartex" xmlns:cx8="http://schemas.microsoft.com/office/drawing/2016/5/14/chartex" xmlns:mc="http://schemas.openxmlformats.org/markup-compatibility/2006" xmlns:m="http://schemas.openxmlformats.org/officeDocument/2006/math" xmlns:aink="http://schemas.microsoft.com/office/drawing/2016/ink" xmlns:am3d="http://schemas.microsoft.com/office/drawing/2017/model3d" xmlns:oel="http://schemas.microsoft.com/office/2019/extlst" xmlns:r="http://schemas.openxmlformats.org/officeDocument/2006/relationships" xmlns:wp14="http://schemas.microsoft.com/office/word/2010/wordprocessingDrawing" xmlns:wp="http://schemas.openxmlformats.org/drawingml/2006/wordprocessingDrawing" xmlns:wpg="http://schemas.microsoft.com/office/word/2010/wordprocessingGroup" xmlns:wpi="http://schemas.microsoft.com/office/word/2010/wordprocessingInk" xmlns:wps="http://schemas.microsoft.com/office/word/2010/wordprocessingShape" xmlns:o="urn:schemas-microsoft-com:office:office" xmlns:v="urn:schemas-microsoft-com:vml" xmlns:w10="urn:schemas-microsoft-com:office:word" xmlns:w="http://schemas.openxmlformats.org/wordprocessingml/2006/main" xmlns:w14="http://schemas.microsoft.com/office/word/2010/wordml" xmlns:w15="http://schemas.microsoft.com/office/word/2012/wordml" xmlns:w16cex="http://schemas.microsoft.com/office/word/2018/wordml/cex" xmlns:w16cid="http://schemas.microsoft.com/office/word/2016/wordml/cid" xmlns:w16="http://schemas.microsoft.com/office/word/2018/wordml" xmlns:w16sdtdh="http://schemas.microsoft.com/office/word/2020/wordml/sdtdatahash" xmlns:w16sdtfl="http://schemas.microsoft.com/office/word/2024/wordml/sdtformatlock" xmlns:w16se="http://schemas.microsoft.com/office/word/2015/wordml/symex" xmlns:w16du="http://schemas.microsoft.com/office/word/2023/wordml/word16du" xmlns:wne="http://schemas.microsoft.com/office/word/2006/wordml" mc:Ignorable="w14 w15 w16se w16cid w16 w16cex w16sdtdh w16sdtfl w16du wp14">
+<w:endnotes xmlns:wpc="http://schemas.microsoft.com/office/word/2010/wordprocessingCanvas" xmlns:cx="http://schemas.microsoft.com/office/drawing/2014/chartex" xmlns:cx1="http://schemas.microsoft.com/office/drawing/2015/9/8/chartex" xmlns:cx2="http://schemas.microsoft.com/office/drawing/2015/10/21/chartex" xmlns:cx3="http://schemas.microsoft.com/office/drawing/2016/5/9/chartex" xmlns:cx4="http://schemas.microsoft.com/office/drawing/2016/5/10/chartex" xmlns:cx5="http://schemas.microsoft.com/office/drawing/2016/5/11/chartex" xmlns:cx6="http://schemas.microsoft.com/office/drawing/2016/5/12/chartex" xmlns:cx7="http://schemas.microsoft.com/office/drawing/2016/5/13/chartex" xmlns:cx8="http://schemas.microsoft.com/office/drawing/2016/5/14/chartex" xmlns:mc="http://schemas.openxmlformats.org/markup-compatibility/2006" xmlns:aink="http://schemas.microsoft.com/office/drawing/2016/ink" xmlns:am3d="http://schemas.microsoft.com/office/drawing/2017/model3d" xmlns:o="urn:schemas-microsoft-com:office:office" xmlns:r="http://schemas.openxmlformats.org/officeDocument/2006/relationships" xmlns:m="http://schemas.openxmlformats.org/officeDocument/2006/math" xmlns:v="urn:schemas-microsoft-com:vml" xmlns:wp14="http://schemas.microsoft.com/office/word/2010/wordprocessingDrawing" xmlns:wp="http://schemas.openxmlformats.org/drawingml/2006/wordprocessingDrawing" xmlns:w10="urn:schemas-microsoft-com:office:word" xmlns:w="http://schemas.openxmlformats.org/wordprocessingml/2006/main" xmlns:w14="http://schemas.microsoft.com/office/word/2010/wordml" xmlns:w15="http://schemas.microsoft.com/office/word/2012/wordml" xmlns:w16cex="http://schemas.microsoft.com/office/word/2018/wordml/cex" xmlns:w16cid="http://schemas.microsoft.com/office/word/2016/wordml/cid" xmlns:w16="http://schemas.microsoft.com/office/word/2018/wordml" xmlns:w16sdtdh="http://schemas.microsoft.com/office/word/2020/wordml/sdtdatahash" xmlns:w16se="http://schemas.microsoft.com/office/word/2015/wordml/symex" xmlns:wpg="http://schemas.microsoft.com/office/word/2010/wordprocessingGroup" xmlns:wpi="http://schemas.microsoft.com/office/word/2010/wordprocessingInk" xmlns:wne="http://schemas.microsoft.com/office/word/2006/wordml" xmlns:wps="http://schemas.microsoft.com/office/word/2010/wordprocessingShape" mc:Ignorable="w14 w15 w16se w16cid w16 w16cex w16sdtdh wp14">
   <w:endnote w:type="separator" w:id="-1">
     <w:p>
       <w:pPr>
@@ -2773,7 +3118,7 @@
 </file>
 
 <file path=word/footer1.xml><?xml version="1.0" encoding="utf-8"?>
-<w:ftr xmlns:wpc="http://schemas.microsoft.com/office/word/2010/wordprocessingCanvas" xmlns:cx="http://schemas.microsoft.com/office/drawing/2014/chartex" xmlns:cx1="http://schemas.microsoft.com/office/drawing/2015/9/8/chartex" xmlns:cx2="http://schemas.microsoft.com/office/drawing/2015/10/21/chartex" xmlns:cx3="http://schemas.microsoft.com/office/drawing/2016/5/9/chartex" xmlns:cx4="http://schemas.microsoft.com/office/drawing/2016/5/10/chartex" xmlns:cx5="http://schemas.microsoft.com/office/drawing/2016/5/11/chartex" xmlns:cx6="http://schemas.microsoft.com/office/drawing/2016/5/12/chartex" xmlns:cx7="http://schemas.microsoft.com/office/drawing/2016/5/13/chartex" xmlns:cx8="http://schemas.microsoft.com/office/drawing/2016/5/14/chartex" xmlns:mc="http://schemas.openxmlformats.org/markup-compatibility/2006" xmlns:m="http://schemas.openxmlformats.org/officeDocument/2006/math" xmlns:aink="http://schemas.microsoft.com/office/drawing/2016/ink" xmlns:am3d="http://schemas.microsoft.com/office/drawing/2017/model3d" xmlns:oel="http://schemas.microsoft.com/office/2019/extlst" xmlns:r="http://schemas.openxmlformats.org/officeDocument/2006/relationships" xmlns:wp14="http://schemas.microsoft.com/office/word/2010/wordprocessingDrawing" xmlns:wp="http://schemas.openxmlformats.org/drawingml/2006/wordprocessingDrawing" xmlns:wpg="http://schemas.microsoft.com/office/word/2010/wordprocessingGroup" xmlns:wpi="http://schemas.microsoft.com/office/word/2010/wordprocessingInk" xmlns:wps="http://schemas.microsoft.com/office/word/2010/wordprocessingShape" xmlns:o="urn:schemas-microsoft-com:office:office" xmlns:v="urn:schemas-microsoft-com:vml" xmlns:w10="urn:schemas-microsoft-com:office:word" xmlns:w="http://schemas.openxmlformats.org/wordprocessingml/2006/main" xmlns:w14="http://schemas.microsoft.com/office/word/2010/wordml" xmlns:w15="http://schemas.microsoft.com/office/word/2012/wordml" xmlns:w16cex="http://schemas.microsoft.com/office/word/2018/wordml/cex" xmlns:w16cid="http://schemas.microsoft.com/office/word/2016/wordml/cid" xmlns:w16="http://schemas.microsoft.com/office/word/2018/wordml" xmlns:w16sdtdh="http://schemas.microsoft.com/office/word/2020/wordml/sdtdatahash" xmlns:w16sdtfl="http://schemas.microsoft.com/office/word/2024/wordml/sdtformatlock" xmlns:w16se="http://schemas.microsoft.com/office/word/2015/wordml/symex" xmlns:w16du="http://schemas.microsoft.com/office/word/2023/wordml/word16du" xmlns:wne="http://schemas.microsoft.com/office/word/2006/wordml" mc:Ignorable="w14 w15 w16se w16cid w16 w16cex w16sdtdh w16sdtfl w16du wp14">
+<w:ftr xmlns:wpc="http://schemas.microsoft.com/office/word/2010/wordprocessingCanvas" xmlns:cx="http://schemas.microsoft.com/office/drawing/2014/chartex" xmlns:cx1="http://schemas.microsoft.com/office/drawing/2015/9/8/chartex" xmlns:cx2="http://schemas.microsoft.com/office/drawing/2015/10/21/chartex" xmlns:cx3="http://schemas.microsoft.com/office/drawing/2016/5/9/chartex" xmlns:cx4="http://schemas.microsoft.com/office/drawing/2016/5/10/chartex" xmlns:cx5="http://schemas.microsoft.com/office/drawing/2016/5/11/chartex" xmlns:cx6="http://schemas.microsoft.com/office/drawing/2016/5/12/chartex" xmlns:cx7="http://schemas.microsoft.com/office/drawing/2016/5/13/chartex" xmlns:cx8="http://schemas.microsoft.com/office/drawing/2016/5/14/chartex" xmlns:mc="http://schemas.openxmlformats.org/markup-compatibility/2006" xmlns:aink="http://schemas.microsoft.com/office/drawing/2016/ink" xmlns:am3d="http://schemas.microsoft.com/office/drawing/2017/model3d" xmlns:o="urn:schemas-microsoft-com:office:office" xmlns:r="http://schemas.openxmlformats.org/officeDocument/2006/relationships" xmlns:m="http://schemas.openxmlformats.org/officeDocument/2006/math" xmlns:v="urn:schemas-microsoft-com:vml" xmlns:wp14="http://schemas.microsoft.com/office/word/2010/wordprocessingDrawing" xmlns:wp="http://schemas.openxmlformats.org/drawingml/2006/wordprocessingDrawing" xmlns:w10="urn:schemas-microsoft-com:office:word" xmlns:w="http://schemas.openxmlformats.org/wordprocessingml/2006/main" xmlns:w14="http://schemas.microsoft.com/office/word/2010/wordml" xmlns:w15="http://schemas.microsoft.com/office/word/2012/wordml" xmlns:w16cex="http://schemas.microsoft.com/office/word/2018/wordml/cex" xmlns:w16cid="http://schemas.microsoft.com/office/word/2016/wordml/cid" xmlns:w16="http://schemas.microsoft.com/office/word/2018/wordml" xmlns:w16sdtdh="http://schemas.microsoft.com/office/word/2020/wordml/sdtdatahash" xmlns:w16se="http://schemas.microsoft.com/office/word/2015/wordml/symex" xmlns:wpg="http://schemas.microsoft.com/office/word/2010/wordprocessingGroup" xmlns:wpi="http://schemas.microsoft.com/office/word/2010/wordprocessingInk" xmlns:wne="http://schemas.microsoft.com/office/word/2006/wordml" xmlns:wps="http://schemas.microsoft.com/office/word/2010/wordprocessingShape" mc:Ignorable="w14 w15 w16se w16cid w16 w16cex w16sdtdh wp14">
   <w:sdt>
     <w:sdtPr>
       <w:id w:val="14532529"/>
@@ -2782,6 +3127,7 @@
         <w:docPartUnique/>
       </w:docPartObj>
     </w:sdtPr>
+    <w:sdtEndPr/>
     <w:sdtContent>
       <w:p>
         <w:pPr>
@@ -2801,13 +3147,7 @@
           <w:rPr>
             <w:noProof/>
           </w:rPr>
-          <w:t>1</w:t>
-        </w:r>
-        <w:r>
-          <w:rPr>
-            <w:noProof/>
-          </w:rPr>
-          <w:t>3</w:t>
+          <w:t>13</w:t>
         </w:r>
         <w:r>
           <w:rPr>
@@ -2827,7 +3167,7 @@
 </file>
 
 <file path=word/footnotes.xml><?xml version="1.0" encoding="utf-8"?>
-<w:footnotes xmlns:wpc="http://schemas.microsoft.com/office/word/2010/wordprocessingCanvas" xmlns:cx="http://schemas.microsoft.com/office/drawing/2014/chartex" xmlns:cx1="http://schemas.microsoft.com/office/drawing/2015/9/8/chartex" xmlns:cx2="http://schemas.microsoft.com/office/drawing/2015/10/21/chartex" xmlns:cx3="http://schemas.microsoft.com/office/drawing/2016/5/9/chartex" xmlns:cx4="http://schemas.microsoft.com/office/drawing/2016/5/10/chartex" xmlns:cx5="http://schemas.microsoft.com/office/drawing/2016/5/11/chartex" xmlns:cx6="http://schemas.microsoft.com/office/drawing/2016/5/12/chartex" xmlns:cx7="http://schemas.microsoft.com/office/drawing/2016/5/13/chartex" xmlns:cx8="http://schemas.microsoft.com/office/drawing/2016/5/14/chartex" xmlns:mc="http://schemas.openxmlformats.org/markup-compatibility/2006" xmlns:m="http://schemas.openxmlformats.org/officeDocument/2006/math" xmlns:aink="http://schemas.microsoft.com/office/drawing/2016/ink" xmlns:am3d="http://schemas.microsoft.com/office/drawing/2017/model3d" xmlns:oel="http://schemas.microsoft.com/office/2019/extlst" xmlns:r="http://schemas.openxmlformats.org/officeDocument/2006/relationships" xmlns:wp14="http://schemas.microsoft.com/office/word/2010/wordprocessingDrawing" xmlns:wp="http://schemas.openxmlformats.org/drawingml/2006/wordprocessingDrawing" xmlns:wpg="http://schemas.microsoft.com/office/word/2010/wordprocessingGroup" xmlns:wpi="http://schemas.microsoft.com/office/word/2010/wordprocessingInk" xmlns:wps="http://schemas.microsoft.com/office/word/2010/wordprocessingShape" xmlns:o="urn:schemas-microsoft-com:office:office" xmlns:v="urn:schemas-microsoft-com:vml" xmlns:w10="urn:schemas-microsoft-com:office:word" xmlns:w="http://schemas.openxmlformats.org/wordprocessingml/2006/main" xmlns:w14="http://schemas.microsoft.com/office/word/2010/wordml" xmlns:w15="http://schemas.microsoft.com/office/word/2012/wordml" xmlns:w16cex="http://schemas.microsoft.com/office/word/2018/wordml/cex" xmlns:w16cid="http://schemas.microsoft.com/office/word/2016/wordml/cid" xmlns:w16="http://schemas.microsoft.com/office/word/2018/wordml" xmlns:w16sdtdh="http://schemas.microsoft.com/office/word/2020/wordml/sdtdatahash" xmlns:w16sdtfl="http://schemas.microsoft.com/office/word/2024/wordml/sdtformatlock" xmlns:w16se="http://schemas.microsoft.com/office/word/2015/wordml/symex" xmlns:w16du="http://schemas.microsoft.com/office/word/2023/wordml/word16du" xmlns:wne="http://schemas.microsoft.com/office/word/2006/wordml" mc:Ignorable="w14 w15 w16se w16cid w16 w16cex w16sdtdh w16sdtfl w16du wp14">
+<w:footnotes xmlns:wpc="http://schemas.microsoft.com/office/word/2010/wordprocessingCanvas" xmlns:cx="http://schemas.microsoft.com/office/drawing/2014/chartex" xmlns:cx1="http://schemas.microsoft.com/office/drawing/2015/9/8/chartex" xmlns:cx2="http://schemas.microsoft.com/office/drawing/2015/10/21/chartex" xmlns:cx3="http://schemas.microsoft.com/office/drawing/2016/5/9/chartex" xmlns:cx4="http://schemas.microsoft.com/office/drawing/2016/5/10/chartex" xmlns:cx5="http://schemas.microsoft.com/office/drawing/2016/5/11/chartex" xmlns:cx6="http://schemas.microsoft.com/office/drawing/2016/5/12/chartex" xmlns:cx7="http://schemas.microsoft.com/office/drawing/2016/5/13/chartex" xmlns:cx8="http://schemas.microsoft.com/office/drawing/2016/5/14/chartex" xmlns:mc="http://schemas.openxmlformats.org/markup-compatibility/2006" xmlns:aink="http://schemas.microsoft.com/office/drawing/2016/ink" xmlns:am3d="http://schemas.microsoft.com/office/drawing/2017/model3d" xmlns:o="urn:schemas-microsoft-com:office:office" xmlns:r="http://schemas.openxmlformats.org/officeDocument/2006/relationships" xmlns:m="http://schemas.openxmlformats.org/officeDocument/2006/math" xmlns:v="urn:schemas-microsoft-com:vml" xmlns:wp14="http://schemas.microsoft.com/office/word/2010/wordprocessingDrawing" xmlns:wp="http://schemas.openxmlformats.org/drawingml/2006/wordprocessingDrawing" xmlns:w10="urn:schemas-microsoft-com:office:word" xmlns:w="http://schemas.openxmlformats.org/wordprocessingml/2006/main" xmlns:w14="http://schemas.microsoft.com/office/word/2010/wordml" xmlns:w15="http://schemas.microsoft.com/office/word/2012/wordml" xmlns:w16cex="http://schemas.microsoft.com/office/word/2018/wordml/cex" xmlns:w16cid="http://schemas.microsoft.com/office/word/2016/wordml/cid" xmlns:w16="http://schemas.microsoft.com/office/word/2018/wordml" xmlns:w16sdtdh="http://schemas.microsoft.com/office/word/2020/wordml/sdtdatahash" xmlns:w16se="http://schemas.microsoft.com/office/word/2015/wordml/symex" xmlns:wpg="http://schemas.microsoft.com/office/word/2010/wordprocessingGroup" xmlns:wpi="http://schemas.microsoft.com/office/word/2010/wordprocessingInk" xmlns:wne="http://schemas.microsoft.com/office/word/2006/wordml" xmlns:wps="http://schemas.microsoft.com/office/word/2010/wordprocessingShape" mc:Ignorable="w14 w15 w16se w16cid w16 w16cex w16sdtdh wp14">
   <w:footnote w:type="separator" w:id="-1">
     <w:p>
       <w:pPr>
@@ -2852,7 +3192,7 @@
 </file>
 
 <file path=word/header1.xml><?xml version="1.0" encoding="utf-8"?>
-<w:hdr xmlns:wpc="http://schemas.microsoft.com/office/word/2010/wordprocessingCanvas" xmlns:cx="http://schemas.microsoft.com/office/drawing/2014/chartex" xmlns:cx1="http://schemas.microsoft.com/office/drawing/2015/9/8/chartex" xmlns:cx2="http://schemas.microsoft.com/office/drawing/2015/10/21/chartex" xmlns:cx3="http://schemas.microsoft.com/office/drawing/2016/5/9/chartex" xmlns:cx4="http://schemas.microsoft.com/office/drawing/2016/5/10/chartex" xmlns:cx5="http://schemas.microsoft.com/office/drawing/2016/5/11/chartex" xmlns:cx6="http://schemas.microsoft.com/office/drawing/2016/5/12/chartex" xmlns:cx7="http://schemas.microsoft.com/office/drawing/2016/5/13/chartex" xmlns:cx8="http://schemas.microsoft.com/office/drawing/2016/5/14/chartex" xmlns:mc="http://schemas.openxmlformats.org/markup-compatibility/2006" xmlns:m="http://schemas.openxmlformats.org/officeDocument/2006/math" xmlns:aink="http://schemas.microsoft.com/office/drawing/2016/ink" xmlns:am3d="http://schemas.microsoft.com/office/drawing/2017/model3d" xmlns:oel="http://schemas.microsoft.com/office/2019/extlst" xmlns:r="http://schemas.openxmlformats.org/officeDocument/2006/relationships" xmlns:wp14="http://schemas.microsoft.com/office/word/2010/wordprocessingDrawing" xmlns:wp="http://schemas.openxmlformats.org/drawingml/2006/wordprocessingDrawing" xmlns:wpg="http://schemas.microsoft.com/office/word/2010/wordprocessingGroup" xmlns:wpi="http://schemas.microsoft.com/office/word/2010/wordprocessingInk" xmlns:wps="http://schemas.microsoft.com/office/word/2010/wordprocessingShape" xmlns:o="urn:schemas-microsoft-com:office:office" xmlns:v="urn:schemas-microsoft-com:vml" xmlns:w10="urn:schemas-microsoft-com:office:word" xmlns:w="http://schemas.openxmlformats.org/wordprocessingml/2006/main" xmlns:w14="http://schemas.microsoft.com/office/word/2010/wordml" xmlns:w15="http://schemas.microsoft.com/office/word/2012/wordml" xmlns:w16cex="http://schemas.microsoft.com/office/word/2018/wordml/cex" xmlns:w16cid="http://schemas.microsoft.com/office/word/2016/wordml/cid" xmlns:w16="http://schemas.microsoft.com/office/word/2018/wordml" xmlns:w16sdtdh="http://schemas.microsoft.com/office/word/2020/wordml/sdtdatahash" xmlns:w16sdtfl="http://schemas.microsoft.com/office/word/2024/wordml/sdtformatlock" xmlns:w16se="http://schemas.microsoft.com/office/word/2015/wordml/symex" xmlns:w16du="http://schemas.microsoft.com/office/word/2023/wordml/word16du" xmlns:wne="http://schemas.microsoft.com/office/word/2006/wordml" mc:Ignorable="w14 w15 w16se w16cid w16 w16cex w16sdtdh w16sdtfl w16du wp14">
+<w:hdr xmlns:wpc="http://schemas.microsoft.com/office/word/2010/wordprocessingCanvas" xmlns:cx="http://schemas.microsoft.com/office/drawing/2014/chartex" xmlns:cx1="http://schemas.microsoft.com/office/drawing/2015/9/8/chartex" xmlns:cx2="http://schemas.microsoft.com/office/drawing/2015/10/21/chartex" xmlns:cx3="http://schemas.microsoft.com/office/drawing/2016/5/9/chartex" xmlns:cx4="http://schemas.microsoft.com/office/drawing/2016/5/10/chartex" xmlns:cx5="http://schemas.microsoft.com/office/drawing/2016/5/11/chartex" xmlns:cx6="http://schemas.microsoft.com/office/drawing/2016/5/12/chartex" xmlns:cx7="http://schemas.microsoft.com/office/drawing/2016/5/13/chartex" xmlns:cx8="http://schemas.microsoft.com/office/drawing/2016/5/14/chartex" xmlns:mc="http://schemas.openxmlformats.org/markup-compatibility/2006" xmlns:aink="http://schemas.microsoft.com/office/drawing/2016/ink" xmlns:am3d="http://schemas.microsoft.com/office/drawing/2017/model3d" xmlns:o="urn:schemas-microsoft-com:office:office" xmlns:r="http://schemas.openxmlformats.org/officeDocument/2006/relationships" xmlns:m="http://schemas.openxmlformats.org/officeDocument/2006/math" xmlns:v="urn:schemas-microsoft-com:vml" xmlns:wp14="http://schemas.microsoft.com/office/word/2010/wordprocessingDrawing" xmlns:wp="http://schemas.openxmlformats.org/drawingml/2006/wordprocessingDrawing" xmlns:w10="urn:schemas-microsoft-com:office:word" xmlns:w="http://schemas.openxmlformats.org/wordprocessingml/2006/main" xmlns:w14="http://schemas.microsoft.com/office/word/2010/wordml" xmlns:w15="http://schemas.microsoft.com/office/word/2012/wordml" xmlns:w16cex="http://schemas.microsoft.com/office/word/2018/wordml/cex" xmlns:w16cid="http://schemas.microsoft.com/office/word/2016/wordml/cid" xmlns:w16="http://schemas.microsoft.com/office/word/2018/wordml" xmlns:w16sdtdh="http://schemas.microsoft.com/office/word/2020/wordml/sdtdatahash" xmlns:w16se="http://schemas.microsoft.com/office/word/2015/wordml/symex" xmlns:wpg="http://schemas.microsoft.com/office/word/2010/wordprocessingGroup" xmlns:wpi="http://schemas.microsoft.com/office/word/2010/wordprocessingInk" xmlns:wne="http://schemas.microsoft.com/office/word/2006/wordml" xmlns:wps="http://schemas.microsoft.com/office/word/2010/wordprocessingShape" mc:Ignorable="w14 w15 w16se w16cid w16 w16cex w16sdtdh wp14">
   <w:p>
     <w:pPr>
       <w:pStyle w:val="Encabezado"/>
@@ -2967,7 +3307,7 @@
 </file>
 
 <file path=word/header2.xml><?xml version="1.0" encoding="utf-8"?>
-<w:hdr xmlns:wpc="http://schemas.microsoft.com/office/word/2010/wordprocessingCanvas" xmlns:cx="http://schemas.microsoft.com/office/drawing/2014/chartex" xmlns:cx1="http://schemas.microsoft.com/office/drawing/2015/9/8/chartex" xmlns:cx2="http://schemas.microsoft.com/office/drawing/2015/10/21/chartex" xmlns:cx3="http://schemas.microsoft.com/office/drawing/2016/5/9/chartex" xmlns:cx4="http://schemas.microsoft.com/office/drawing/2016/5/10/chartex" xmlns:cx5="http://schemas.microsoft.com/office/drawing/2016/5/11/chartex" xmlns:cx6="http://schemas.microsoft.com/office/drawing/2016/5/12/chartex" xmlns:cx7="http://schemas.microsoft.com/office/drawing/2016/5/13/chartex" xmlns:cx8="http://schemas.microsoft.com/office/drawing/2016/5/14/chartex" xmlns:mc="http://schemas.openxmlformats.org/markup-compatibility/2006" xmlns:m="http://schemas.openxmlformats.org/officeDocument/2006/math" xmlns:aink="http://schemas.microsoft.com/office/drawing/2016/ink" xmlns:am3d="http://schemas.microsoft.com/office/drawing/2017/model3d" xmlns:oel="http://schemas.microsoft.com/office/2019/extlst" xmlns:r="http://schemas.openxmlformats.org/officeDocument/2006/relationships" xmlns:wp14="http://schemas.microsoft.com/office/word/2010/wordprocessingDrawing" xmlns:wp="http://schemas.openxmlformats.org/drawingml/2006/wordprocessingDrawing" xmlns:wpg="http://schemas.microsoft.com/office/word/2010/wordprocessingGroup" xmlns:wpi="http://schemas.microsoft.com/office/word/2010/wordprocessingInk" xmlns:wps="http://schemas.microsoft.com/office/word/2010/wordprocessingShape" xmlns:o="urn:schemas-microsoft-com:office:office" xmlns:v="urn:schemas-microsoft-com:vml" xmlns:w10="urn:schemas-microsoft-com:office:word" xmlns:w="http://schemas.openxmlformats.org/wordprocessingml/2006/main" xmlns:w14="http://schemas.microsoft.com/office/word/2010/wordml" xmlns:w15="http://schemas.microsoft.com/office/word/2012/wordml" xmlns:w16cex="http://schemas.microsoft.com/office/word/2018/wordml/cex" xmlns:w16cid="http://schemas.microsoft.com/office/word/2016/wordml/cid" xmlns:w16="http://schemas.microsoft.com/office/word/2018/wordml" xmlns:w16sdtdh="http://schemas.microsoft.com/office/word/2020/wordml/sdtdatahash" xmlns:w16sdtfl="http://schemas.microsoft.com/office/word/2024/wordml/sdtformatlock" xmlns:w16se="http://schemas.microsoft.com/office/word/2015/wordml/symex" xmlns:w16du="http://schemas.microsoft.com/office/word/2023/wordml/word16du" xmlns:wne="http://schemas.microsoft.com/office/word/2006/wordml" mc:Ignorable="w14 w15 w16se w16cid w16 w16cex w16sdtdh w16sdtfl w16du wp14">
+<w:hdr xmlns:wpc="http://schemas.microsoft.com/office/word/2010/wordprocessingCanvas" xmlns:cx="http://schemas.microsoft.com/office/drawing/2014/chartex" xmlns:cx1="http://schemas.microsoft.com/office/drawing/2015/9/8/chartex" xmlns:cx2="http://schemas.microsoft.com/office/drawing/2015/10/21/chartex" xmlns:cx3="http://schemas.microsoft.com/office/drawing/2016/5/9/chartex" xmlns:cx4="http://schemas.microsoft.com/office/drawing/2016/5/10/chartex" xmlns:cx5="http://schemas.microsoft.com/office/drawing/2016/5/11/chartex" xmlns:cx6="http://schemas.microsoft.com/office/drawing/2016/5/12/chartex" xmlns:cx7="http://schemas.microsoft.com/office/drawing/2016/5/13/chartex" xmlns:cx8="http://schemas.microsoft.com/office/drawing/2016/5/14/chartex" xmlns:mc="http://schemas.openxmlformats.org/markup-compatibility/2006" xmlns:aink="http://schemas.microsoft.com/office/drawing/2016/ink" xmlns:am3d="http://schemas.microsoft.com/office/drawing/2017/model3d" xmlns:o="urn:schemas-microsoft-com:office:office" xmlns:r="http://schemas.openxmlformats.org/officeDocument/2006/relationships" xmlns:m="http://schemas.openxmlformats.org/officeDocument/2006/math" xmlns:v="urn:schemas-microsoft-com:vml" xmlns:wp14="http://schemas.microsoft.com/office/word/2010/wordprocessingDrawing" xmlns:wp="http://schemas.openxmlformats.org/drawingml/2006/wordprocessingDrawing" xmlns:w10="urn:schemas-microsoft-com:office:word" xmlns:w="http://schemas.openxmlformats.org/wordprocessingml/2006/main" xmlns:w14="http://schemas.microsoft.com/office/word/2010/wordml" xmlns:w15="http://schemas.microsoft.com/office/word/2012/wordml" xmlns:w16cex="http://schemas.microsoft.com/office/word/2018/wordml/cex" xmlns:w16cid="http://schemas.microsoft.com/office/word/2016/wordml/cid" xmlns:w16="http://schemas.microsoft.com/office/word/2018/wordml" xmlns:w16sdtdh="http://schemas.microsoft.com/office/word/2020/wordml/sdtdatahash" xmlns:w16se="http://schemas.microsoft.com/office/word/2015/wordml/symex" xmlns:wpg="http://schemas.microsoft.com/office/word/2010/wordprocessingGroup" xmlns:wpi="http://schemas.microsoft.com/office/word/2010/wordprocessingInk" xmlns:wne="http://schemas.microsoft.com/office/word/2006/wordml" xmlns:wps="http://schemas.microsoft.com/office/word/2010/wordprocessingShape" mc:Ignorable="w14 w15 w16se w16cid w16 w16cex w16sdtdh wp14">
   <w:p>
     <w:pPr>
       <w:pStyle w:val="Encabezado"/>
@@ -3019,7 +3359,7 @@
 </file>
 
 <file path=word/numbering.xml><?xml version="1.0" encoding="utf-8"?>
-<w:numbering xmlns:wpc="http://schemas.microsoft.com/office/word/2010/wordprocessingCanvas" xmlns:cx="http://schemas.microsoft.com/office/drawing/2014/chartex" xmlns:cx1="http://schemas.microsoft.com/office/drawing/2015/9/8/chartex" xmlns:cx2="http://schemas.microsoft.com/office/drawing/2015/10/21/chartex" xmlns:cx3="http://schemas.microsoft.com/office/drawing/2016/5/9/chartex" xmlns:cx4="http://schemas.microsoft.com/office/drawing/2016/5/10/chartex" xmlns:cx5="http://schemas.microsoft.com/office/drawing/2016/5/11/chartex" xmlns:cx6="http://schemas.microsoft.com/office/drawing/2016/5/12/chartex" xmlns:cx7="http://schemas.microsoft.com/office/drawing/2016/5/13/chartex" xmlns:cx8="http://schemas.microsoft.com/office/drawing/2016/5/14/chartex" xmlns:mc="http://schemas.openxmlformats.org/markup-compatibility/2006" xmlns:m="http://schemas.openxmlformats.org/officeDocument/2006/math" xmlns:aink="http://schemas.microsoft.com/office/drawing/2016/ink" xmlns:am3d="http://schemas.microsoft.com/office/drawing/2017/model3d" xmlns:oel="http://schemas.microsoft.com/office/2019/extlst" xmlns:r="http://schemas.openxmlformats.org/officeDocument/2006/relationships" xmlns:wp14="http://schemas.microsoft.com/office/word/2010/wordprocessingDrawing" xmlns:wp="http://schemas.openxmlformats.org/drawingml/2006/wordprocessingDrawing" xmlns:wpg="http://schemas.microsoft.com/office/word/2010/wordprocessingGroup" xmlns:wpi="http://schemas.microsoft.com/office/word/2010/wordprocessingInk" xmlns:wps="http://schemas.microsoft.com/office/word/2010/wordprocessingShape" xmlns:o="urn:schemas-microsoft-com:office:office" xmlns:v="urn:schemas-microsoft-com:vml" xmlns:w10="urn:schemas-microsoft-com:office:word" xmlns:w="http://schemas.openxmlformats.org/wordprocessingml/2006/main" xmlns:w14="http://schemas.microsoft.com/office/word/2010/wordml" xmlns:w15="http://schemas.microsoft.com/office/word/2012/wordml" xmlns:w16cex="http://schemas.microsoft.com/office/word/2018/wordml/cex" xmlns:w16cid="http://schemas.microsoft.com/office/word/2016/wordml/cid" xmlns:w16="http://schemas.microsoft.com/office/word/2018/wordml" xmlns:w16sdtdh="http://schemas.microsoft.com/office/word/2020/wordml/sdtdatahash" xmlns:w16sdtfl="http://schemas.microsoft.com/office/word/2024/wordml/sdtformatlock" xmlns:w16se="http://schemas.microsoft.com/office/word/2015/wordml/symex" xmlns:w16du="http://schemas.microsoft.com/office/word/2023/wordml/word16du" xmlns:wne="http://schemas.microsoft.com/office/word/2006/wordml" mc:Ignorable="w14 w15 w16se w16cid w16 w16cex w16sdtdh w16sdtfl w16du wp14">
+<w:numbering xmlns:wpc="http://schemas.microsoft.com/office/word/2010/wordprocessingCanvas" xmlns:cx="http://schemas.microsoft.com/office/drawing/2014/chartex" xmlns:cx1="http://schemas.microsoft.com/office/drawing/2015/9/8/chartex" xmlns:cx2="http://schemas.microsoft.com/office/drawing/2015/10/21/chartex" xmlns:cx3="http://schemas.microsoft.com/office/drawing/2016/5/9/chartex" xmlns:cx4="http://schemas.microsoft.com/office/drawing/2016/5/10/chartex" xmlns:cx5="http://schemas.microsoft.com/office/drawing/2016/5/11/chartex" xmlns:cx6="http://schemas.microsoft.com/office/drawing/2016/5/12/chartex" xmlns:cx7="http://schemas.microsoft.com/office/drawing/2016/5/13/chartex" xmlns:cx8="http://schemas.microsoft.com/office/drawing/2016/5/14/chartex" xmlns:mc="http://schemas.openxmlformats.org/markup-compatibility/2006" xmlns:aink="http://schemas.microsoft.com/office/drawing/2016/ink" xmlns:am3d="http://schemas.microsoft.com/office/drawing/2017/model3d" xmlns:o="urn:schemas-microsoft-com:office:office" xmlns:r="http://schemas.openxmlformats.org/officeDocument/2006/relationships" xmlns:m="http://schemas.openxmlformats.org/officeDocument/2006/math" xmlns:v="urn:schemas-microsoft-com:vml" xmlns:wp14="http://schemas.microsoft.com/office/word/2010/wordprocessingDrawing" xmlns:wp="http://schemas.openxmlformats.org/drawingml/2006/wordprocessingDrawing" xmlns:w10="urn:schemas-microsoft-com:office:word" xmlns:w="http://schemas.openxmlformats.org/wordprocessingml/2006/main" xmlns:w14="http://schemas.microsoft.com/office/word/2010/wordml" xmlns:w15="http://schemas.microsoft.com/office/word/2012/wordml" xmlns:w16cex="http://schemas.microsoft.com/office/word/2018/wordml/cex" xmlns:w16cid="http://schemas.microsoft.com/office/word/2016/wordml/cid" xmlns:w16="http://schemas.microsoft.com/office/word/2018/wordml" xmlns:w16sdtdh="http://schemas.microsoft.com/office/word/2020/wordml/sdtdatahash" xmlns:w16se="http://schemas.microsoft.com/office/word/2015/wordml/symex" xmlns:wpg="http://schemas.microsoft.com/office/word/2010/wordprocessingGroup" xmlns:wpi="http://schemas.microsoft.com/office/word/2010/wordprocessingInk" xmlns:wne="http://schemas.microsoft.com/office/word/2006/wordml" xmlns:wps="http://schemas.microsoft.com/office/word/2010/wordprocessingShape" mc:Ignorable="w14 w15 w16se w16cid w16 w16cex w16sdtdh wp14">
   <w:abstractNum w:abstractNumId="0" w15:restartNumberingAfterBreak="0">
     <w:nsid w:val="042A6B37"/>
     <w:multiLevelType w:val="hybridMultilevel"/>
@@ -3309,6 +3649,120 @@
     </w:lvl>
   </w:abstractNum>
   <w:abstractNum w:abstractNumId="3" w15:restartNumberingAfterBreak="0">
+    <w:nsid w:val="08EC7ABC"/>
+    <w:multiLevelType w:val="hybridMultilevel"/>
+    <w:tmpl w:val="EBFE14AA"/>
+    <w:lvl w:ilvl="0" w:tplc="93CC7CD8">
+      <w:start w:val="1"/>
+      <w:numFmt w:val="bullet"/>
+      <w:lvlText w:val="-"/>
+      <w:lvlJc w:val="left"/>
+      <w:pPr>
+        <w:ind w:left="720" w:hanging="360"/>
+      </w:pPr>
+      <w:rPr>
+        <w:rFonts w:ascii="Calibri" w:eastAsia="Times New Roman" w:hAnsi="Calibri" w:cs="Calibri" w:hint="default"/>
+        <w:b/>
+      </w:rPr>
+    </w:lvl>
+    <w:lvl w:ilvl="1" w:tplc="340A0003" w:tentative="1">
+      <w:start w:val="1"/>
+      <w:numFmt w:val="bullet"/>
+      <w:lvlText w:val="o"/>
+      <w:lvlJc w:val="left"/>
+      <w:pPr>
+        <w:ind w:left="1440" w:hanging="360"/>
+      </w:pPr>
+      <w:rPr>
+        <w:rFonts w:ascii="Courier New" w:hAnsi="Courier New" w:cs="Courier New" w:hint="default"/>
+      </w:rPr>
+    </w:lvl>
+    <w:lvl w:ilvl="2" w:tplc="340A0005" w:tentative="1">
+      <w:start w:val="1"/>
+      <w:numFmt w:val="bullet"/>
+      <w:lvlText w:val=""/>
+      <w:lvlJc w:val="left"/>
+      <w:pPr>
+        <w:ind w:left="2160" w:hanging="360"/>
+      </w:pPr>
+      <w:rPr>
+        <w:rFonts w:ascii="Wingdings" w:hAnsi="Wingdings" w:hint="default"/>
+      </w:rPr>
+    </w:lvl>
+    <w:lvl w:ilvl="3" w:tplc="340A0001" w:tentative="1">
+      <w:start w:val="1"/>
+      <w:numFmt w:val="bullet"/>
+      <w:lvlText w:val=""/>
+      <w:lvlJc w:val="left"/>
+      <w:pPr>
+        <w:ind w:left="2880" w:hanging="360"/>
+      </w:pPr>
+      <w:rPr>
+        <w:rFonts w:ascii="Symbol" w:hAnsi="Symbol" w:hint="default"/>
+      </w:rPr>
+    </w:lvl>
+    <w:lvl w:ilvl="4" w:tplc="340A0003" w:tentative="1">
+      <w:start w:val="1"/>
+      <w:numFmt w:val="bullet"/>
+      <w:lvlText w:val="o"/>
+      <w:lvlJc w:val="left"/>
+      <w:pPr>
+        <w:ind w:left="3600" w:hanging="360"/>
+      </w:pPr>
+      <w:rPr>
+        <w:rFonts w:ascii="Courier New" w:hAnsi="Courier New" w:cs="Courier New" w:hint="default"/>
+      </w:rPr>
+    </w:lvl>
+    <w:lvl w:ilvl="5" w:tplc="340A0005" w:tentative="1">
+      <w:start w:val="1"/>
+      <w:numFmt w:val="bullet"/>
+      <w:lvlText w:val=""/>
+      <w:lvlJc w:val="left"/>
+      <w:pPr>
+        <w:ind w:left="4320" w:hanging="360"/>
+      </w:pPr>
+      <w:rPr>
+        <w:rFonts w:ascii="Wingdings" w:hAnsi="Wingdings" w:hint="default"/>
+      </w:rPr>
+    </w:lvl>
+    <w:lvl w:ilvl="6" w:tplc="340A0001" w:tentative="1">
+      <w:start w:val="1"/>
+      <w:numFmt w:val="bullet"/>
+      <w:lvlText w:val=""/>
+      <w:lvlJc w:val="left"/>
+      <w:pPr>
+        <w:ind w:left="5040" w:hanging="360"/>
+      </w:pPr>
+      <w:rPr>
+        <w:rFonts w:ascii="Symbol" w:hAnsi="Symbol" w:hint="default"/>
+      </w:rPr>
+    </w:lvl>
+    <w:lvl w:ilvl="7" w:tplc="340A0003" w:tentative="1">
+      <w:start w:val="1"/>
+      <w:numFmt w:val="bullet"/>
+      <w:lvlText w:val="o"/>
+      <w:lvlJc w:val="left"/>
+      <w:pPr>
+        <w:ind w:left="5760" w:hanging="360"/>
+      </w:pPr>
+      <w:rPr>
+        <w:rFonts w:ascii="Courier New" w:hAnsi="Courier New" w:cs="Courier New" w:hint="default"/>
+      </w:rPr>
+    </w:lvl>
+    <w:lvl w:ilvl="8" w:tplc="340A0005" w:tentative="1">
+      <w:start w:val="1"/>
+      <w:numFmt w:val="bullet"/>
+      <w:lvlText w:val=""/>
+      <w:lvlJc w:val="left"/>
+      <w:pPr>
+        <w:ind w:left="6480" w:hanging="360"/>
+      </w:pPr>
+      <w:rPr>
+        <w:rFonts w:ascii="Wingdings" w:hAnsi="Wingdings" w:hint="default"/>
+      </w:rPr>
+    </w:lvl>
+  </w:abstractNum>
+  <w:abstractNum w:abstractNumId="4" w15:restartNumberingAfterBreak="0">
     <w:nsid w:val="273F5792"/>
     <w:multiLevelType w:val="hybridMultilevel"/>
     <w:tmpl w:val="A706FB68"/>
@@ -3421,7 +3875,7 @@
       </w:rPr>
     </w:lvl>
   </w:abstractNum>
-  <w:abstractNum w:abstractNumId="4" w15:restartNumberingAfterBreak="0">
+  <w:abstractNum w:abstractNumId="5" w15:restartNumberingAfterBreak="0">
     <w:nsid w:val="27AE77F4"/>
     <w:multiLevelType w:val="hybridMultilevel"/>
     <w:tmpl w:val="43404632"/>
@@ -3534,7 +3988,7 @@
       </w:rPr>
     </w:lvl>
   </w:abstractNum>
-  <w:abstractNum w:abstractNumId="5" w15:restartNumberingAfterBreak="0">
+  <w:abstractNum w:abstractNumId="6" w15:restartNumberingAfterBreak="0">
     <w:nsid w:val="2B895CBE"/>
     <w:multiLevelType w:val="multilevel"/>
     <w:tmpl w:val="5324F4FC"/>
@@ -3629,7 +4083,156 @@
       </w:pPr>
     </w:lvl>
   </w:abstractNum>
-  <w:abstractNum w:abstractNumId="6" w15:restartNumberingAfterBreak="0">
+  <w:abstractNum w:abstractNumId="7" w15:restartNumberingAfterBreak="0">
+    <w:nsid w:val="3CA5369D"/>
+    <w:multiLevelType w:val="multilevel"/>
+    <w:tmpl w:val="D6C01C22"/>
+    <w:lvl w:ilvl="0">
+      <w:start w:val="1"/>
+      <w:numFmt w:val="bullet"/>
+      <w:lvlText w:val=""/>
+      <w:lvlJc w:val="left"/>
+      <w:pPr>
+        <w:tabs>
+          <w:tab w:val="num" w:pos="720"/>
+        </w:tabs>
+        <w:ind w:left="720" w:hanging="360"/>
+      </w:pPr>
+      <w:rPr>
+        <w:rFonts w:ascii="Symbol" w:hAnsi="Symbol" w:hint="default"/>
+        <w:sz w:val="20"/>
+      </w:rPr>
+    </w:lvl>
+    <w:lvl w:ilvl="1" w:tentative="1">
+      <w:start w:val="1"/>
+      <w:numFmt w:val="bullet"/>
+      <w:lvlText w:val="o"/>
+      <w:lvlJc w:val="left"/>
+      <w:pPr>
+        <w:tabs>
+          <w:tab w:val="num" w:pos="1440"/>
+        </w:tabs>
+        <w:ind w:left="1440" w:hanging="360"/>
+      </w:pPr>
+      <w:rPr>
+        <w:rFonts w:ascii="Courier New" w:hAnsi="Courier New" w:hint="default"/>
+        <w:sz w:val="20"/>
+      </w:rPr>
+    </w:lvl>
+    <w:lvl w:ilvl="2" w:tentative="1">
+      <w:start w:val="1"/>
+      <w:numFmt w:val="bullet"/>
+      <w:lvlText w:val=""/>
+      <w:lvlJc w:val="left"/>
+      <w:pPr>
+        <w:tabs>
+          <w:tab w:val="num" w:pos="2160"/>
+        </w:tabs>
+        <w:ind w:left="2160" w:hanging="360"/>
+      </w:pPr>
+      <w:rPr>
+        <w:rFonts w:ascii="Wingdings" w:hAnsi="Wingdings" w:hint="default"/>
+        <w:sz w:val="20"/>
+      </w:rPr>
+    </w:lvl>
+    <w:lvl w:ilvl="3" w:tentative="1">
+      <w:start w:val="1"/>
+      <w:numFmt w:val="bullet"/>
+      <w:lvlText w:val=""/>
+      <w:lvlJc w:val="left"/>
+      <w:pPr>
+        <w:tabs>
+          <w:tab w:val="num" w:pos="2880"/>
+        </w:tabs>
+        <w:ind w:left="2880" w:hanging="360"/>
+      </w:pPr>
+      <w:rPr>
+        <w:rFonts w:ascii="Wingdings" w:hAnsi="Wingdings" w:hint="default"/>
+        <w:sz w:val="20"/>
+      </w:rPr>
+    </w:lvl>
+    <w:lvl w:ilvl="4" w:tentative="1">
+      <w:start w:val="1"/>
+      <w:numFmt w:val="bullet"/>
+      <w:lvlText w:val=""/>
+      <w:lvlJc w:val="left"/>
+      <w:pPr>
+        <w:tabs>
+          <w:tab w:val="num" w:pos="3600"/>
+        </w:tabs>
+        <w:ind w:left="3600" w:hanging="360"/>
+      </w:pPr>
+      <w:rPr>
+        <w:rFonts w:ascii="Wingdings" w:hAnsi="Wingdings" w:hint="default"/>
+        <w:sz w:val="20"/>
+      </w:rPr>
+    </w:lvl>
+    <w:lvl w:ilvl="5" w:tentative="1">
+      <w:start w:val="1"/>
+      <w:numFmt w:val="bullet"/>
+      <w:lvlText w:val=""/>
+      <w:lvlJc w:val="left"/>
+      <w:pPr>
+        <w:tabs>
+          <w:tab w:val="num" w:pos="4320"/>
+        </w:tabs>
+        <w:ind w:left="4320" w:hanging="360"/>
+      </w:pPr>
+      <w:rPr>
+        <w:rFonts w:ascii="Wingdings" w:hAnsi="Wingdings" w:hint="default"/>
+        <w:sz w:val="20"/>
+      </w:rPr>
+    </w:lvl>
+    <w:lvl w:ilvl="6" w:tentative="1">
+      <w:start w:val="1"/>
+      <w:numFmt w:val="bullet"/>
+      <w:lvlText w:val=""/>
+      <w:lvlJc w:val="left"/>
+      <w:pPr>
+        <w:tabs>
+          <w:tab w:val="num" w:pos="5040"/>
+        </w:tabs>
+        <w:ind w:left="5040" w:hanging="360"/>
+      </w:pPr>
+      <w:rPr>
+        <w:rFonts w:ascii="Wingdings" w:hAnsi="Wingdings" w:hint="default"/>
+        <w:sz w:val="20"/>
+      </w:rPr>
+    </w:lvl>
+    <w:lvl w:ilvl="7" w:tentative="1">
+      <w:start w:val="1"/>
+      <w:numFmt w:val="bullet"/>
+      <w:lvlText w:val=""/>
+      <w:lvlJc w:val="left"/>
+      <w:pPr>
+        <w:tabs>
+          <w:tab w:val="num" w:pos="5760"/>
+        </w:tabs>
+        <w:ind w:left="5760" w:hanging="360"/>
+      </w:pPr>
+      <w:rPr>
+        <w:rFonts w:ascii="Wingdings" w:hAnsi="Wingdings" w:hint="default"/>
+        <w:sz w:val="20"/>
+      </w:rPr>
+    </w:lvl>
+    <w:lvl w:ilvl="8" w:tentative="1">
+      <w:start w:val="1"/>
+      <w:numFmt w:val="bullet"/>
+      <w:lvlText w:val=""/>
+      <w:lvlJc w:val="left"/>
+      <w:pPr>
+        <w:tabs>
+          <w:tab w:val="num" w:pos="6480"/>
+        </w:tabs>
+        <w:ind w:left="6480" w:hanging="360"/>
+      </w:pPr>
+      <w:rPr>
+        <w:rFonts w:ascii="Wingdings" w:hAnsi="Wingdings" w:hint="default"/>
+        <w:sz w:val="20"/>
+      </w:rPr>
+    </w:lvl>
+  </w:abstractNum>
+  <w:abstractNum w:abstractNumId="8" w15:restartNumberingAfterBreak="0">
     <w:nsid w:val="45D12BE1"/>
     <w:multiLevelType w:val="hybridMultilevel"/>
     <w:tmpl w:val="44B2ED9C"/>
@@ -3742,7 +4345,7 @@
       </w:rPr>
     </w:lvl>
   </w:abstractNum>
-  <w:abstractNum w:abstractNumId="7" w15:restartNumberingAfterBreak="0">
+  <w:abstractNum w:abstractNumId="9" w15:restartNumberingAfterBreak="0">
     <w:nsid w:val="45DB1F84"/>
     <w:multiLevelType w:val="hybridMultilevel"/>
     <w:tmpl w:val="7CF2EF4E"/>
@@ -3828,7 +4431,7 @@
       </w:pPr>
     </w:lvl>
   </w:abstractNum>
-  <w:abstractNum w:abstractNumId="8" w15:restartNumberingAfterBreak="0">
+  <w:abstractNum w:abstractNumId="10" w15:restartNumberingAfterBreak="0">
     <w:nsid w:val="65BA6DC5"/>
     <w:multiLevelType w:val="hybridMultilevel"/>
     <w:tmpl w:val="BE0A0C50"/>
@@ -3941,7 +4544,7 @@
       </w:rPr>
     </w:lvl>
   </w:abstractNum>
-  <w:abstractNum w:abstractNumId="9" w15:restartNumberingAfterBreak="0">
+  <w:abstractNum w:abstractNumId="11" w15:restartNumberingAfterBreak="0">
     <w:nsid w:val="69616CB8"/>
     <w:multiLevelType w:val="hybridMultilevel"/>
     <w:tmpl w:val="23EC7D4A"/>
@@ -4054,7 +4657,7 @@
       </w:rPr>
     </w:lvl>
   </w:abstractNum>
-  <w:abstractNum w:abstractNumId="10" w15:restartNumberingAfterBreak="0">
+  <w:abstractNum w:abstractNumId="12" w15:restartNumberingAfterBreak="0">
     <w:nsid w:val="6B625092"/>
     <w:multiLevelType w:val="hybridMultilevel"/>
     <w:tmpl w:val="86F61076"/>
@@ -4167,7 +4770,7 @@
       </w:rPr>
     </w:lvl>
   </w:abstractNum>
-  <w:abstractNum w:abstractNumId="11" w15:restartNumberingAfterBreak="0">
+  <w:abstractNum w:abstractNumId="13" w15:restartNumberingAfterBreak="0">
     <w:nsid w:val="76304F08"/>
     <w:multiLevelType w:val="hybridMultilevel"/>
     <w:tmpl w:val="BBB47B0A"/>
@@ -4279,7 +4882,7 @@
       </w:rPr>
     </w:lvl>
   </w:abstractNum>
-  <w:abstractNum w:abstractNumId="12" w15:restartNumberingAfterBreak="0">
+  <w:abstractNum w:abstractNumId="14" w15:restartNumberingAfterBreak="0">
     <w:nsid w:val="7A7120EA"/>
     <w:multiLevelType w:val="hybridMultilevel"/>
     <w:tmpl w:val="B714EC70"/>
@@ -4419,50 +5022,56 @@
       </w:rPr>
     </w:lvl>
   </w:abstractNum>
-  <w:num w:numId="1" w16cid:durableId="317540622">
+  <w:num w:numId="1">
     <w:abstractNumId w:val="0"/>
   </w:num>
-  <w:num w:numId="2" w16cid:durableId="2045672853">
+  <w:num w:numId="2">
+    <w:abstractNumId w:val="9"/>
+  </w:num>
+  <w:num w:numId="3">
+    <w:abstractNumId w:val="1"/>
+  </w:num>
+  <w:num w:numId="4">
+    <w:abstractNumId w:val="12"/>
+  </w:num>
+  <w:num w:numId="5">
+    <w:abstractNumId w:val="13"/>
+  </w:num>
+  <w:num w:numId="6">
+    <w:abstractNumId w:val="2"/>
+  </w:num>
+  <w:num w:numId="7">
+    <w:abstractNumId w:val="8"/>
+  </w:num>
+  <w:num w:numId="8">
+    <w:abstractNumId w:val="10"/>
+  </w:num>
+  <w:num w:numId="9">
+    <w:abstractNumId w:val="5"/>
+  </w:num>
+  <w:num w:numId="10">
+    <w:abstractNumId w:val="4"/>
+  </w:num>
+  <w:num w:numId="11">
+    <w:abstractNumId w:val="11"/>
+  </w:num>
+  <w:num w:numId="12">
+    <w:abstractNumId w:val="6"/>
+  </w:num>
+  <w:num w:numId="13">
+    <w:abstractNumId w:val="14"/>
+  </w:num>
+  <w:num w:numId="14">
     <w:abstractNumId w:val="7"/>
   </w:num>
-  <w:num w:numId="3" w16cid:durableId="1798642824">
-    <w:abstractNumId w:val="1"/>
-  </w:num>
-  <w:num w:numId="4" w16cid:durableId="983237737">
-    <w:abstractNumId w:val="10"/>
-  </w:num>
-  <w:num w:numId="5" w16cid:durableId="490171255">
-    <w:abstractNumId w:val="11"/>
-  </w:num>
-  <w:num w:numId="6" w16cid:durableId="340814691">
-    <w:abstractNumId w:val="2"/>
-  </w:num>
-  <w:num w:numId="7" w16cid:durableId="1344936245">
-    <w:abstractNumId w:val="6"/>
-  </w:num>
-  <w:num w:numId="8" w16cid:durableId="1353531980">
-    <w:abstractNumId w:val="8"/>
-  </w:num>
-  <w:num w:numId="9" w16cid:durableId="1518156833">
-    <w:abstractNumId w:val="4"/>
-  </w:num>
-  <w:num w:numId="10" w16cid:durableId="1113330907">
+  <w:num w:numId="15">
     <w:abstractNumId w:val="3"/>
-  </w:num>
-  <w:num w:numId="11" w16cid:durableId="526329763">
-    <w:abstractNumId w:val="9"/>
-  </w:num>
-  <w:num w:numId="12" w16cid:durableId="67458668">
-    <w:abstractNumId w:val="5"/>
-  </w:num>
-  <w:num w:numId="13" w16cid:durableId="137234301">
-    <w:abstractNumId w:val="12"/>
   </w:num>
 </w:numbering>
 </file>
 
 <file path=word/styles.xml><?xml version="1.0" encoding="utf-8"?>
-<w:styles xmlns:mc="http://schemas.openxmlformats.org/markup-compatibility/2006" xmlns:r="http://schemas.openxmlformats.org/officeDocument/2006/relationships" xmlns:w="http://schemas.openxmlformats.org/wordprocessingml/2006/main" xmlns:w14="http://schemas.microsoft.com/office/word/2010/wordml" xmlns:w15="http://schemas.microsoft.com/office/word/2012/wordml" xmlns:w16cex="http://schemas.microsoft.com/office/word/2018/wordml/cex" xmlns:w16cid="http://schemas.microsoft.com/office/word/2016/wordml/cid" xmlns:w16="http://schemas.microsoft.com/office/word/2018/wordml" xmlns:w16sdtdh="http://schemas.microsoft.com/office/word/2020/wordml/sdtdatahash" xmlns:w16sdtfl="http://schemas.microsoft.com/office/word/2024/wordml/sdtformatlock" xmlns:w16se="http://schemas.microsoft.com/office/word/2015/wordml/symex" xmlns:w16du="http://schemas.microsoft.com/office/word/2023/wordml/word16du" mc:Ignorable="w14 w15 w16se w16cid w16 w16cex w16sdtdh w16sdtfl w16du">
+<w:styles xmlns:mc="http://schemas.openxmlformats.org/markup-compatibility/2006" xmlns:r="http://schemas.openxmlformats.org/officeDocument/2006/relationships" xmlns:w="http://schemas.openxmlformats.org/wordprocessingml/2006/main" xmlns:w14="http://schemas.microsoft.com/office/word/2010/wordml" xmlns:w15="http://schemas.microsoft.com/office/word/2012/wordml" xmlns:w16cex="http://schemas.microsoft.com/office/word/2018/wordml/cex" xmlns:w16cid="http://schemas.microsoft.com/office/word/2016/wordml/cid" xmlns:w16="http://schemas.microsoft.com/office/word/2018/wordml" xmlns:w16sdtdh="http://schemas.microsoft.com/office/word/2020/wordml/sdtdatahash" xmlns:w16se="http://schemas.microsoft.com/office/word/2015/wordml/symex" mc:Ignorable="w14 w15 w16se w16cid w16 w16cex w16sdtdh">
   <w:docDefaults>
     <w:rPrDefault>
       <w:rPr>
@@ -5675,11 +6284,28 @@
       <w:szCs w:val="21"/>
     </w:rPr>
   </w:style>
+  <w:style w:type="paragraph" w:styleId="NormalWeb">
+    <w:name w:val="Normal (Web)"/>
+    <w:basedOn w:val="Normal"/>
+    <w:uiPriority w:val="99"/>
+    <w:semiHidden/>
+    <w:unhideWhenUsed/>
+    <w:rsid w:val="00B05E42"/>
+    <w:pPr>
+      <w:spacing w:before="100" w:beforeAutospacing="1" w:after="100" w:afterAutospacing="1" w:line="240" w:lineRule="auto"/>
+    </w:pPr>
+    <w:rPr>
+      <w:rFonts w:ascii="Times New Roman" w:eastAsia="Times New Roman" w:hAnsi="Times New Roman" w:cs="Times New Roman"/>
+      <w:sz w:val="24"/>
+      <w:szCs w:val="24"/>
+      <w:lang w:val="es-CL" w:eastAsia="es-CL"/>
+    </w:rPr>
+  </w:style>
 </w:styles>
 </file>
 
 <file path=word/glossary/document.xml><?xml version="1.0" encoding="utf-8"?>
-<w:glossaryDocument xmlns:wpc="http://schemas.microsoft.com/office/word/2010/wordprocessingCanvas" xmlns:cx="http://schemas.microsoft.com/office/drawing/2014/chartex" xmlns:cx1="http://schemas.microsoft.com/office/drawing/2015/9/8/chartex" xmlns:cx2="http://schemas.microsoft.com/office/drawing/2015/10/21/chartex" xmlns:cx3="http://schemas.microsoft.com/office/drawing/2016/5/9/chartex" xmlns:cx4="http://schemas.microsoft.com/office/drawing/2016/5/10/chartex" xmlns:cx5="http://schemas.microsoft.com/office/drawing/2016/5/11/chartex" xmlns:cx6="http://schemas.microsoft.com/office/drawing/2016/5/12/chartex" xmlns:cx7="http://schemas.microsoft.com/office/drawing/2016/5/13/chartex" xmlns:cx8="http://schemas.microsoft.com/office/drawing/2016/5/14/chartex" xmlns:mc="http://schemas.openxmlformats.org/markup-compatibility/2006" xmlns:m="http://schemas.openxmlformats.org/officeDocument/2006/math" xmlns:aink="http://schemas.microsoft.com/office/drawing/2016/ink" xmlns:am3d="http://schemas.microsoft.com/office/drawing/2017/model3d" xmlns:oel="http://schemas.microsoft.com/office/2019/extlst" xmlns:r="http://schemas.openxmlformats.org/officeDocument/2006/relationships" xmlns:wp14="http://schemas.microsoft.com/office/word/2010/wordprocessingDrawing" xmlns:wp="http://schemas.openxmlformats.org/drawingml/2006/wordprocessingDrawing" xmlns:wpg="http://schemas.microsoft.com/office/word/2010/wordprocessingGroup" xmlns:wpi="http://schemas.microsoft.com/office/word/2010/wordprocessingInk" xmlns:wps="http://schemas.microsoft.com/office/word/2010/wordprocessingShape" xmlns:o="urn:schemas-microsoft-com:office:office" xmlns:v="urn:schemas-microsoft-com:vml" xmlns:w10="urn:schemas-microsoft-com:office:word" xmlns:w="http://schemas.openxmlformats.org/wordprocessingml/2006/main" xmlns:w14="http://schemas.microsoft.com/office/word/2010/wordml" xmlns:w15="http://schemas.microsoft.com/office/word/2012/wordml" xmlns:w16cex="http://schemas.microsoft.com/office/word/2018/wordml/cex" xmlns:w16cid="http://schemas.microsoft.com/office/word/2016/wordml/cid" xmlns:w16="http://schemas.microsoft.com/office/word/2018/wordml" xmlns:w16sdtdh="http://schemas.microsoft.com/office/word/2020/wordml/sdtdatahash" xmlns:w16sdtfl="http://schemas.microsoft.com/office/word/2024/wordml/sdtformatlock" xmlns:w16se="http://schemas.microsoft.com/office/word/2015/wordml/symex" xmlns:w16du="http://schemas.microsoft.com/office/word/2023/wordml/word16du" xmlns:wne="http://schemas.microsoft.com/office/word/2006/wordml" mc:Ignorable="w14 w15 w16se w16cid w16 w16cex w16sdtdh w16sdtfl w16du wp14">
+<w:glossaryDocument xmlns:wpc="http://schemas.microsoft.com/office/word/2010/wordprocessingCanvas" xmlns:cx="http://schemas.microsoft.com/office/drawing/2014/chartex" xmlns:cx1="http://schemas.microsoft.com/office/drawing/2015/9/8/chartex" xmlns:cx2="http://schemas.microsoft.com/office/drawing/2015/10/21/chartex" xmlns:cx3="http://schemas.microsoft.com/office/drawing/2016/5/9/chartex" xmlns:cx4="http://schemas.microsoft.com/office/drawing/2016/5/10/chartex" xmlns:cx5="http://schemas.microsoft.com/office/drawing/2016/5/11/chartex" xmlns:cx6="http://schemas.microsoft.com/office/drawing/2016/5/12/chartex" xmlns:cx7="http://schemas.microsoft.com/office/drawing/2016/5/13/chartex" xmlns:cx8="http://schemas.microsoft.com/office/drawing/2016/5/14/chartex" xmlns:mc="http://schemas.openxmlformats.org/markup-compatibility/2006" xmlns:aink="http://schemas.microsoft.com/office/drawing/2016/ink" xmlns:am3d="http://schemas.microsoft.com/office/drawing/2017/model3d" xmlns:o="urn:schemas-microsoft-com:office:office" xmlns:r="http://schemas.openxmlformats.org/officeDocument/2006/relationships" xmlns:m="http://schemas.openxmlformats.org/officeDocument/2006/math" xmlns:v="urn:schemas-microsoft-com:vml" xmlns:wp14="http://schemas.microsoft.com/office/word/2010/wordprocessingDrawing" xmlns:wp="http://schemas.openxmlformats.org/drawingml/2006/wordprocessingDrawing" xmlns:w10="urn:schemas-microsoft-com:office:word" xmlns:w="http://schemas.openxmlformats.org/wordprocessingml/2006/main" xmlns:w14="http://schemas.microsoft.com/office/word/2010/wordml" xmlns:w15="http://schemas.microsoft.com/office/word/2012/wordml" xmlns:w16cex="http://schemas.microsoft.com/office/word/2018/wordml/cex" xmlns:w16cid="http://schemas.microsoft.com/office/word/2016/wordml/cid" xmlns:w16="http://schemas.microsoft.com/office/word/2018/wordml" xmlns:w16sdtdh="http://schemas.microsoft.com/office/word/2020/wordml/sdtdatahash" xmlns:w16se="http://schemas.microsoft.com/office/word/2015/wordml/symex" xmlns:wpg="http://schemas.microsoft.com/office/word/2010/wordprocessingGroup" xmlns:wpi="http://schemas.microsoft.com/office/word/2010/wordprocessingInk" xmlns:wne="http://schemas.microsoft.com/office/word/2006/wordml" xmlns:wps="http://schemas.microsoft.com/office/word/2010/wordprocessingShape" mc:Ignorable="w14 w15 w16se w16cid w16 w16cex w16sdtdh wp14">
   <w:docParts>
     <w:docPart>
       <w:docPartPr>
@@ -5749,7 +6375,7 @@
 </file>
 
 <file path=word/glossary/fontTable.xml><?xml version="1.0" encoding="utf-8"?>
-<w:fonts xmlns:mc="http://schemas.openxmlformats.org/markup-compatibility/2006" xmlns:r="http://schemas.openxmlformats.org/officeDocument/2006/relationships" xmlns:w="http://schemas.openxmlformats.org/wordprocessingml/2006/main" xmlns:w14="http://schemas.microsoft.com/office/word/2010/wordml" xmlns:w15="http://schemas.microsoft.com/office/word/2012/wordml" xmlns:w16cex="http://schemas.microsoft.com/office/word/2018/wordml/cex" xmlns:w16cid="http://schemas.microsoft.com/office/word/2016/wordml/cid" xmlns:w16="http://schemas.microsoft.com/office/word/2018/wordml" xmlns:w16sdtdh="http://schemas.microsoft.com/office/word/2020/wordml/sdtdatahash" xmlns:w16sdtfl="http://schemas.microsoft.com/office/word/2024/wordml/sdtformatlock" xmlns:w16se="http://schemas.microsoft.com/office/word/2015/wordml/symex" xmlns:w16du="http://schemas.microsoft.com/office/word/2023/wordml/word16du" mc:Ignorable="w14 w15 w16se w16cid w16 w16cex w16sdtdh w16sdtfl w16du">
+<w:fonts xmlns:mc="http://schemas.openxmlformats.org/markup-compatibility/2006" xmlns:r="http://schemas.openxmlformats.org/officeDocument/2006/relationships" xmlns:w="http://schemas.openxmlformats.org/wordprocessingml/2006/main" xmlns:w14="http://schemas.microsoft.com/office/word/2010/wordml" xmlns:w15="http://schemas.microsoft.com/office/word/2012/wordml" xmlns:w16cex="http://schemas.microsoft.com/office/word/2018/wordml/cex" xmlns:w16cid="http://schemas.microsoft.com/office/word/2016/wordml/cid" xmlns:w16="http://schemas.microsoft.com/office/word/2018/wordml" xmlns:w16sdtdh="http://schemas.microsoft.com/office/word/2020/wordml/sdtdatahash" xmlns:w16se="http://schemas.microsoft.com/office/word/2015/wordml/symex" mc:Ignorable="w14 w15 w16se w16cid w16 w16cex w16sdtdh">
   <w:font w:name="Times New Roman">
     <w:panose1 w:val="02020603050405020304"/>
     <w:charset w:val="00"/>
@@ -5760,7 +6386,7 @@
   <w:font w:name="Symbol">
     <w:panose1 w:val="05050102010706020507"/>
     <w:charset w:val="02"/>
-    <w:family w:val="decorative"/>
+    <w:family w:val="roman"/>
     <w:pitch w:val="variable"/>
     <w:sig w:usb0="00000000" w:usb1="10000000" w:usb2="00000000" w:usb3="00000000" w:csb0="80000000" w:csb1="00000000"/>
   </w:font>
@@ -5773,10 +6399,10 @@
   </w:font>
   <w:font w:name="Wingdings">
     <w:panose1 w:val="05000000000000000000"/>
-    <w:charset w:val="4D"/>
-    <w:family w:val="decorative"/>
+    <w:charset w:val="02"/>
+    <w:family w:val="auto"/>
     <w:pitch w:val="variable"/>
-    <w:sig w:usb0="00000003" w:usb1="00000000" w:usb2="00000000" w:usb3="00000000" w:csb0="80000001" w:csb1="00000000"/>
+    <w:sig w:usb0="00000000" w:usb1="10000000" w:usb2="00000000" w:usb3="00000000" w:csb0="80000000" w:csb1="00000000"/>
   </w:font>
   <w:font w:name="Calibri">
     <w:panose1 w:val="020F0502020204030204"/>
@@ -5805,7 +6431,7 @@
     <w:charset w:val="00"/>
     <w:family w:val="swiss"/>
     <w:pitch w:val="variable"/>
-    <w:sig w:usb0="E0002AFF" w:usb1="C0007843" w:usb2="00000009" w:usb3="00000000" w:csb0="000001FF" w:csb1="00000000"/>
+    <w:sig w:usb0="E0002EFF" w:usb1="C000785B" w:usb2="00000009" w:usb3="00000000" w:csb0="000001FF" w:csb1="00000000"/>
   </w:font>
   <w:font w:name="Tahoma">
     <w:panose1 w:val="020B0604030504040204"/>
@@ -5822,27 +6448,18 @@
     <w:pitch w:val="fixed"/>
     <w:sig w:usb0="E00002FF" w:usb1="6AC7FDFB" w:usb2="08000012" w:usb3="00000000" w:csb0="0002009F" w:csb1="00000000"/>
   </w:font>
-  <w:font w:name="Aptos">
-    <w:panose1 w:val="020B0004020202020204"/>
+  <w:font w:name="Yu Mincho">
+    <w:charset w:val="80"/>
+    <w:family w:val="roman"/>
+    <w:pitch w:val="variable"/>
+    <w:sig w:usb0="800002E7" w:usb1="2AC7FCFF" w:usb2="00000012" w:usb3="00000000" w:csb0="0002009F" w:csb1="00000000"/>
+  </w:font>
+  <w:font w:name="Calibri Light">
+    <w:panose1 w:val="020F0302020204030204"/>
     <w:charset w:val="00"/>
     <w:family w:val="swiss"/>
     <w:pitch w:val="variable"/>
-    <w:sig w:usb0="20000287" w:usb1="00000003" w:usb2="00000000" w:usb3="00000000" w:csb0="0000019F" w:csb1="00000000"/>
-  </w:font>
-  <w:font w:name="Yu Mincho">
-    <w:panose1 w:val="02020400000000000000"/>
-    <w:charset w:val="80"/>
-    <w:family w:val="roman"/>
-    <w:notTrueType/>
-    <w:pitch w:val="variable"/>
-    <w:sig w:usb0="800002E7" w:usb1="2AC7FCFF" w:usb2="00000012" w:usb3="00000000" w:csb0="0002009F" w:csb1="00000000"/>
-  </w:font>
-  <w:font w:name="Aptos Display">
-    <w:panose1 w:val="020B0004020202020204"/>
-    <w:charset w:val="01"/>
-    <w:family w:val="swiss"/>
-    <w:pitch w:val="variable"/>
-    <w:sig w:usb0="20000287" w:usb1="00000003" w:usb2="00000000" w:usb3="00000000" w:csb0="0000019F" w:csb1="00000000"/>
+    <w:sig w:usb0="E4002EFF" w:usb1="C200247B" w:usb2="00000009" w:usb3="00000000" w:csb0="000001FF" w:csb1="00000000"/>
   </w:font>
   <w:font w:name="Yu Gothic Light">
     <w:panose1 w:val="020B0300000000000000"/>
@@ -5855,7 +6472,7 @@
 </file>
 
 <file path=word/glossary/settings.xml><?xml version="1.0" encoding="utf-8"?>
-<w:settings xmlns:mc="http://schemas.openxmlformats.org/markup-compatibility/2006" xmlns:m="http://schemas.openxmlformats.org/officeDocument/2006/math" xmlns:r="http://schemas.openxmlformats.org/officeDocument/2006/relationships" xmlns:sl="http://schemas.openxmlformats.org/schemaLibrary/2006/main" xmlns:o="urn:schemas-microsoft-com:office:office" xmlns:v="urn:schemas-microsoft-com:vml" xmlns:w10="urn:schemas-microsoft-com:office:word" xmlns:w="http://schemas.openxmlformats.org/wordprocessingml/2006/main" xmlns:w14="http://schemas.microsoft.com/office/word/2010/wordml" xmlns:w15="http://schemas.microsoft.com/office/word/2012/wordml" xmlns:w16cex="http://schemas.microsoft.com/office/word/2018/wordml/cex" xmlns:w16cid="http://schemas.microsoft.com/office/word/2016/wordml/cid" xmlns:w16="http://schemas.microsoft.com/office/word/2018/wordml" xmlns:w16sdtdh="http://schemas.microsoft.com/office/word/2020/wordml/sdtdatahash" xmlns:w16sdtfl="http://schemas.microsoft.com/office/word/2024/wordml/sdtformatlock" xmlns:w16se="http://schemas.microsoft.com/office/word/2015/wordml/symex" xmlns:w16du="http://schemas.microsoft.com/office/word/2023/wordml/word16du" mc:Ignorable="w14 w15 w16se w16cid w16 w16cex w16sdtdh w16sdtfl w16du">
+<w:settings xmlns:mc="http://schemas.openxmlformats.org/markup-compatibility/2006" xmlns:o="urn:schemas-microsoft-com:office:office" xmlns:r="http://schemas.openxmlformats.org/officeDocument/2006/relationships" xmlns:m="http://schemas.openxmlformats.org/officeDocument/2006/math" xmlns:v="urn:schemas-microsoft-com:vml" xmlns:w10="urn:schemas-microsoft-com:office:word" xmlns:w="http://schemas.openxmlformats.org/wordprocessingml/2006/main" xmlns:w14="http://schemas.microsoft.com/office/word/2010/wordml" xmlns:w15="http://schemas.microsoft.com/office/word/2012/wordml" xmlns:w16cex="http://schemas.microsoft.com/office/word/2018/wordml/cex" xmlns:w16cid="http://schemas.microsoft.com/office/word/2016/wordml/cid" xmlns:w16="http://schemas.microsoft.com/office/word/2018/wordml" xmlns:w16sdtdh="http://schemas.microsoft.com/office/word/2020/wordml/sdtdatahash" xmlns:w16se="http://schemas.microsoft.com/office/word/2015/wordml/symex" xmlns:sl="http://schemas.openxmlformats.org/schemaLibrary/2006/main" mc:Ignorable="w14 w15 w16se w16cid w16 w16cex w16sdtdh">
   <w:view w:val="normal"/>
   <w:defaultTabStop w:val="708"/>
   <w:hyphenationZone w:val="425"/>
@@ -5881,6 +6498,7 @@
     <w:rsid w:val="00687CD9"/>
     <w:rsid w:val="006E2FCC"/>
     <w:rsid w:val="00704192"/>
+    <w:rsid w:val="007E6D6B"/>
     <w:rsid w:val="00825B36"/>
     <w:rsid w:val="009007E1"/>
     <w:rsid w:val="00960213"/>
@@ -5915,7 +6533,7 @@
 </file>
 
 <file path=word/glossary/styles.xml><?xml version="1.0" encoding="utf-8"?>
-<w:styles xmlns:mc="http://schemas.openxmlformats.org/markup-compatibility/2006" xmlns:r="http://schemas.openxmlformats.org/officeDocument/2006/relationships" xmlns:w="http://schemas.openxmlformats.org/wordprocessingml/2006/main" xmlns:w14="http://schemas.microsoft.com/office/word/2010/wordml" xmlns:w15="http://schemas.microsoft.com/office/word/2012/wordml" xmlns:w16cex="http://schemas.microsoft.com/office/word/2018/wordml/cex" xmlns:w16cid="http://schemas.microsoft.com/office/word/2016/wordml/cid" xmlns:w16="http://schemas.microsoft.com/office/word/2018/wordml" xmlns:w16sdtdh="http://schemas.microsoft.com/office/word/2020/wordml/sdtdatahash" xmlns:w16sdtfl="http://schemas.microsoft.com/office/word/2024/wordml/sdtformatlock" xmlns:w16se="http://schemas.microsoft.com/office/word/2015/wordml/symex" xmlns:w16du="http://schemas.microsoft.com/office/word/2023/wordml/word16du" mc:Ignorable="w14 w15 w16se w16cid w16 w16cex w16sdtdh w16sdtfl w16du">
+<w:styles xmlns:mc="http://schemas.openxmlformats.org/markup-compatibility/2006" xmlns:r="http://schemas.openxmlformats.org/officeDocument/2006/relationships" xmlns:w="http://schemas.openxmlformats.org/wordprocessingml/2006/main" xmlns:w14="http://schemas.microsoft.com/office/word/2010/wordml" xmlns:w15="http://schemas.microsoft.com/office/word/2012/wordml" xmlns:w16cex="http://schemas.microsoft.com/office/word/2018/wordml/cex" xmlns:w16cid="http://schemas.microsoft.com/office/word/2016/wordml/cid" xmlns:w16="http://schemas.microsoft.com/office/word/2018/wordml" xmlns:w16sdtdh="http://schemas.microsoft.com/office/word/2020/wordml/sdtdatahash" xmlns:w16se="http://schemas.microsoft.com/office/word/2015/wordml/symex" mc:Ignorable="w14 w15 w16se w16cid w16 w16cex w16sdtdh">
   <w:docDefaults>
     <w:rPrDefault>
       <w:rPr>
@@ -6344,7 +6962,7 @@
 </file>
 
 <file path=word/glossary/webSettings.xml><?xml version="1.0" encoding="utf-8"?>
-<w:webSettings xmlns:mc="http://schemas.openxmlformats.org/markup-compatibility/2006" xmlns:r="http://schemas.openxmlformats.org/officeDocument/2006/relationships" xmlns:w="http://schemas.openxmlformats.org/wordprocessingml/2006/main" xmlns:w14="http://schemas.microsoft.com/office/word/2010/wordml" xmlns:w15="http://schemas.microsoft.com/office/word/2012/wordml" xmlns:w16cex="http://schemas.microsoft.com/office/word/2018/wordml/cex" xmlns:w16cid="http://schemas.microsoft.com/office/word/2016/wordml/cid" xmlns:w16="http://schemas.microsoft.com/office/word/2018/wordml" xmlns:w16sdtdh="http://schemas.microsoft.com/office/word/2020/wordml/sdtdatahash" xmlns:w16sdtfl="http://schemas.microsoft.com/office/word/2024/wordml/sdtformatlock" xmlns:w16se="http://schemas.microsoft.com/office/word/2015/wordml/symex" xmlns:w16du="http://schemas.microsoft.com/office/word/2023/wordml/word16du" mc:Ignorable="w14 w15 w16se w16cid w16 w16cex w16sdtdh w16sdtfl w16du">
+<w:webSettings xmlns:mc="http://schemas.openxmlformats.org/markup-compatibility/2006" xmlns:r="http://schemas.openxmlformats.org/officeDocument/2006/relationships" xmlns:w="http://schemas.openxmlformats.org/wordprocessingml/2006/main" xmlns:w14="http://schemas.microsoft.com/office/word/2010/wordml" xmlns:w15="http://schemas.microsoft.com/office/word/2012/wordml" xmlns:w16cex="http://schemas.microsoft.com/office/word/2018/wordml/cex" xmlns:w16cid="http://schemas.microsoft.com/office/word/2016/wordml/cid" xmlns:w16="http://schemas.microsoft.com/office/word/2018/wordml" xmlns:w16sdtdh="http://schemas.microsoft.com/office/word/2020/wordml/sdtdatahash" xmlns:w16se="http://schemas.microsoft.com/office/word/2015/wordml/symex" mc:Ignorable="w14 w15 w16se w16cid w16 w16cex w16sdtdh">
   <w:optimizeForBrowser/>
 </w:webSettings>
 </file>
@@ -6634,7 +7252,7 @@
 
 <file path=customXml/item1.xml><?xml version="1.0" encoding="utf-8"?>
 <CoverPageProperties xmlns="http://schemas.microsoft.com/office/2006/coverPageProps">
-  <PublishDate/>
+  <PublishDate>2026-09-28T00:00:00</PublishDate>
   <Abstract>Planificación y Especificación de Requisitos según estándares; IEEE 830, ISO9000 y PMI.</Abstract>
   <CompanyAddress/>
   <CompanyPhone/>
@@ -6653,20 +7271,6 @@
 </file>
 
 <file path=customXml/item3.xml><?xml version="1.0" encoding="utf-8"?>
-<p:properties xmlns:p="http://schemas.microsoft.com/office/2006/metadata/properties" xmlns:xsi="http://www.w3.org/2001/XMLSchema-instance" xmlns:pc="http://schemas.microsoft.com/office/infopath/2007/PartnerControls">
-  <documentManagement>
-    <lcf76f155ced4ddcb4097134ff3c332f xmlns="e1e7bc46-bed0-459f-9452-a76b1c5b695e">
-      <Terms xmlns="http://schemas.microsoft.com/office/infopath/2007/PartnerControls"/>
-    </lcf76f155ced4ddcb4097134ff3c332f>
-  </documentManagement>
-</p:properties>
-</file>
-
-<file path=customXml/item4.xml><?xml version="1.0" encoding="utf-8"?>
-<b:Sources xmlns:b="http://schemas.openxmlformats.org/officeDocument/2006/bibliography" xmlns="http://schemas.openxmlformats.org/officeDocument/2006/bibliography" SelectedStyle="\APA.XSL" StyleName="APA"/>
-</file>
-
-<file path=customXml/item5.xml><?xml version="1.0" encoding="utf-8"?>
 <ct:contentTypeSchema xmlns:ct="http://schemas.microsoft.com/office/2006/metadata/contentType" xmlns:ma="http://schemas.microsoft.com/office/2006/metadata/properties/metaAttributes" ct:_="" ma:_="" ma:contentTypeName="Documento" ma:contentTypeID="0x0101005395107FFD641345A10C8A5ACACB9D20" ma:contentTypeVersion="13" ma:contentTypeDescription="Crear nuevo documento." ma:contentTypeScope="" ma:versionID="7407f70e7181b908656026f379795b2c">
   <xsd:schema xmlns:xsd="http://www.w3.org/2001/XMLSchema" xmlns:xs="http://www.w3.org/2001/XMLSchema" xmlns:p="http://schemas.microsoft.com/office/2006/metadata/properties" xmlns:ns2="e1e7bc46-bed0-459f-9452-a76b1c5b695e" xmlns:ns3="bb8cf7e1-610f-40a0-8f00-126b9d139fde" targetNamespace="http://schemas.microsoft.com/office/2006/metadata/properties" ma:root="true" ma:fieldsID="b29ea8901729e1eaaa4e48e09148c760" ns2:_="" ns3:_="">
     <xsd:import namespace="e1e7bc46-bed0-459f-9452-a76b1c5b695e"/>
@@ -6883,6 +7487,20 @@
 </ct:contentTypeSchema>
 </file>
 
+<file path=customXml/item4.xml><?xml version="1.0" encoding="utf-8"?>
+<b:Sources xmlns:b="http://schemas.openxmlformats.org/officeDocument/2006/bibliography" xmlns="http://schemas.openxmlformats.org/officeDocument/2006/bibliography" SelectedStyle="\APA.XSL" StyleName="APA"/>
+</file>
+
+<file path=customXml/item5.xml><?xml version="1.0" encoding="utf-8"?>
+<p:properties xmlns:p="http://schemas.microsoft.com/office/2006/metadata/properties" xmlns:xsi="http://www.w3.org/2001/XMLSchema-instance" xmlns:pc="http://schemas.microsoft.com/office/infopath/2007/PartnerControls">
+  <documentManagement>
+    <lcf76f155ced4ddcb4097134ff3c332f xmlns="e1e7bc46-bed0-459f-9452-a76b1c5b695e">
+      <Terms xmlns="http://schemas.microsoft.com/office/infopath/2007/PartnerControls"/>
+    </lcf76f155ced4ddcb4097134ff3c332f>
+  </documentManagement>
+</p:properties>
+</file>
+
 <file path=customXml/itemProps1.xml><?xml version="1.0" encoding="utf-8"?>
 <ds:datastoreItem xmlns:ds="http://schemas.openxmlformats.org/officeDocument/2006/customXml" ds:itemID="{55AF091B-3C7A-41E3-B477-F2FDAA23CFDA}">
   <ds:schemaRefs>
@@ -6900,24 +7518,6 @@
 </file>
 
 <file path=customXml/itemProps3.xml><?xml version="1.0" encoding="utf-8"?>
-<ds:datastoreItem xmlns:ds="http://schemas.openxmlformats.org/officeDocument/2006/customXml" ds:itemID="{E1036DFC-1D85-404D-898C-621D06C0EB1C}">
-  <ds:schemaRefs>
-    <ds:schemaRef ds:uri="http://schemas.microsoft.com/office/2006/metadata/properties"/>
-    <ds:schemaRef ds:uri="http://schemas.microsoft.com/office/infopath/2007/PartnerControls"/>
-    <ds:schemaRef ds:uri="e1e7bc46-bed0-459f-9452-a76b1c5b695e"/>
-  </ds:schemaRefs>
-</ds:datastoreItem>
-</file>
-
-<file path=customXml/itemProps4.xml><?xml version="1.0" encoding="utf-8"?>
-<ds:datastoreItem xmlns:ds="http://schemas.openxmlformats.org/officeDocument/2006/customXml" ds:itemID="{BD6EC776-6679-4C69-98E3-6D068EA0A3C9}">
-  <ds:schemaRefs>
-    <ds:schemaRef ds:uri="http://schemas.openxmlformats.org/officeDocument/2006/bibliography"/>
-  </ds:schemaRefs>
-</ds:datastoreItem>
-</file>
-
-<file path=customXml/itemProps5.xml><?xml version="1.0" encoding="utf-8"?>
 <ds:datastoreItem xmlns:ds="http://schemas.openxmlformats.org/officeDocument/2006/customXml" ds:itemID="{444115BD-C1C6-48AD-B714-E1866627071D}">
   <ds:schemaRefs>
     <ds:schemaRef ds:uri="http://schemas.microsoft.com/office/2006/metadata/contentType"/>
@@ -6934,4 +7534,22 @@
     <ds:schemaRef ds:uri="http://schemas.microsoft.com/internal/obd"/>
   </ds:schemaRefs>
 </ds:datastoreItem>
+</file>
+
+<file path=customXml/itemProps4.xml><?xml version="1.0" encoding="utf-8"?>
+<ds:datastoreItem xmlns:ds="http://schemas.openxmlformats.org/officeDocument/2006/customXml" ds:itemID="{BD6EC776-6679-4C69-98E3-6D068EA0A3C9}">
+  <ds:schemaRefs>
+    <ds:schemaRef ds:uri="http://schemas.openxmlformats.org/officeDocument/2006/bibliography"/>
+  </ds:schemaRefs>
+</ds:datastoreItem>
+</file>
+
+<file path=customXml/itemProps5.xml><?xml version="1.0" encoding="utf-8"?>
+<ds:datastoreItem xmlns:ds="http://schemas.openxmlformats.org/officeDocument/2006/customXml" ds:itemID="{E1036DFC-1D85-404D-898C-621D06C0EB1C}">
+  <ds:schemaRefs>
+    <ds:schemaRef ds:uri="http://schemas.microsoft.com/office/2006/metadata/properties"/>
+    <ds:schemaRef ds:uri="http://schemas.microsoft.com/office/infopath/2007/PartnerControls"/>
+    <ds:schemaRef ds:uri="e1e7bc46-bed0-459f-9452-a76b1c5b695e"/>
+  </ds:schemaRefs>
+</ds:datastoreItem>
 </file>
</xml_diff>